<commit_message>
updating title of project and details
I talked with Muhammed and I can do this project
</commit_message>
<xml_diff>
--- a/Predictive Analytics for Stock.docx
+++ b/Predictive Analytics for Stock.docx
@@ -4,23 +4,107 @@
   <w:body>
     <w:p>
       <w:pPr>
+        <w:spacing w:before="100" w:beforeAutospacing="1" w:after="100" w:afterAutospacing="1" w:line="240" w:lineRule="auto"/>
+      </w:pPr>
+    </w:p>
+    <w:p>
+      <w:pPr>
+        <w:spacing w:before="100" w:beforeAutospacing="1" w:after="100" w:afterAutospacing="1" w:line="240" w:lineRule="auto"/>
+        <w:rPr>
+          <w:rFonts w:ascii="Arial" w:eastAsia="Times New Roman" w:hAnsi="Arial" w:cs="Arial"/>
+          <w:kern w:val="0"/>
+          <w:lang w:eastAsia="en-IE"/>
+          <w14:ligatures w14:val="none"/>
+        </w:rPr>
+      </w:pPr>
+      <w:r>
+        <w:rPr>
+          <w:rFonts w:ascii="Arial" w:eastAsia="Times New Roman" w:hAnsi="Arial" w:cs="Arial"/>
+          <w:b/>
+          <w:bCs/>
+          <w:kern w:val="0"/>
+          <w:lang w:eastAsia="en-IE"/>
+          <w14:ligatures w14:val="none"/>
+        </w:rPr>
+        <w:t>stock shortages &amp; waste →  Deli or Bread</w:t>
+      </w:r>
+    </w:p>
+    <w:p>
+      <w:pPr>
+        <w:spacing w:before="100" w:beforeAutospacing="1" w:after="100" w:afterAutospacing="1" w:line="240" w:lineRule="auto"/>
+        <w:rPr>
+          <w:rFonts w:ascii="Arial" w:eastAsia="Times New Roman" w:hAnsi="Arial" w:cs="Arial"/>
+          <w:b/>
+          <w:bCs/>
+          <w:kern w:val="0"/>
+          <w:lang w:eastAsia="en-IE"/>
+          <w14:ligatures w14:val="none"/>
+        </w:rPr>
+      </w:pPr>
+      <w:r>
+        <w:rPr>
+          <w:rFonts w:ascii="Arial" w:eastAsia="Times New Roman" w:hAnsi="Arial" w:cs="Arial"/>
+          <w:b/>
+          <w:bCs/>
+          <w:kern w:val="0"/>
+          <w:lang w:eastAsia="en-IE"/>
+          <w14:ligatures w14:val="none"/>
+        </w:rPr>
+        <w:t>Analyse pricing &amp; seasonal demand → Cheese or Wine</w:t>
+      </w:r>
+    </w:p>
+    <w:p>
+      <w:pPr>
+        <w:spacing w:before="100" w:beforeAutospacing="1" w:after="100" w:afterAutospacing="1" w:line="240" w:lineRule="auto"/>
+        <w:rPr>
+          <w:rFonts w:ascii="Arial" w:eastAsia="Times New Roman" w:hAnsi="Arial" w:cs="Arial"/>
+          <w:b/>
+          <w:bCs/>
+          <w:kern w:val="0"/>
+          <w:lang w:eastAsia="en-IE"/>
+          <w14:ligatures w14:val="none"/>
+        </w:rPr>
+      </w:pPr>
+      <w:r>
+        <w:rPr>
+          <w:rFonts w:ascii="Arial" w:eastAsia="Times New Roman" w:hAnsi="Arial" w:cs="Arial"/>
+          <w:b/>
+          <w:bCs/>
+          <w:kern w:val="0"/>
+          <w:lang w:eastAsia="en-IE"/>
+          <w14:ligatures w14:val="none"/>
+        </w:rPr>
+        <w:t>Analyse supplier performance → Wine</w:t>
+      </w:r>
+    </w:p>
+    <w:p>
+      <w:pPr>
+        <w:spacing w:before="100" w:beforeAutospacing="1" w:after="100" w:afterAutospacing="1" w:line="240" w:lineRule="auto"/>
+      </w:pPr>
+    </w:p>
+    <w:p>
+      <w:pPr>
         <w:pStyle w:val="ListParagraph"/>
         <w:spacing w:before="100" w:beforeAutospacing="1" w:after="100" w:afterAutospacing="1" w:line="240" w:lineRule="auto"/>
         <w:rPr>
           <w:rFonts w:ascii="Arial" w:eastAsia="Times New Roman" w:hAnsi="Arial" w:cs="Arial"/>
-          <w:kern w:val="0"/>
-          <w:lang w:eastAsia="en-IE"/>
-          <w14:ligatures w14:val="none"/>
-        </w:rPr>
-      </w:pPr>
-      <w:r>
-        <w:rPr>
-          <w:rFonts w:ascii="Arial" w:eastAsia="Times New Roman" w:hAnsi="Arial" w:cs="Arial"/>
-          <w:kern w:val="0"/>
-          <w:lang w:eastAsia="en-IE"/>
-          <w14:ligatures w14:val="none"/>
-        </w:rPr>
-        <w:t xml:space="preserve">ASSIGNMENT </w:t>
+          <w:i/>
+          <w:iCs/>
+          <w:kern w:val="0"/>
+          <w:lang w:eastAsia="en-IE"/>
+          <w14:ligatures w14:val="none"/>
+        </w:rPr>
+      </w:pPr>
+      <w:r>
+        <w:rPr>
+          <w:rFonts w:ascii="Arial" w:eastAsia="Times New Roman" w:hAnsi="Arial" w:cs="Arial"/>
+          <w:i/>
+          <w:iCs/>
+          <w:kern w:val="0"/>
+          <w:lang w:eastAsia="en-IE"/>
+          <w14:ligatures w14:val="none"/>
+        </w:rPr>
+        <w:t xml:space="preserve">Optimising Wine Stock Management at Lotts &amp; Co. Using Data Analytics </w:t>
       </w:r>
     </w:p>
     <w:p>
@@ -29,6 +113,8 @@
         <w:spacing w:before="100" w:beforeAutospacing="1" w:after="100" w:afterAutospacing="1" w:line="240" w:lineRule="auto"/>
         <w:rPr>
           <w:rFonts w:ascii="Arial" w:eastAsia="Times New Roman" w:hAnsi="Arial" w:cs="Arial"/>
+          <w:i/>
+          <w:iCs/>
           <w:kern w:val="0"/>
           <w:lang w:eastAsia="en-IE"/>
           <w14:ligatures w14:val="none"/>
@@ -48,7 +134,11 @@
           <w14:ligatures w14:val="none"/>
         </w:rPr>
       </w:pPr>
-      <w:r>
+    </w:p>
+    <w:p>
+      <w:pPr>
+        <w:pStyle w:val="ListParagraph"/>
+        <w:spacing w:before="100" w:beforeAutospacing="1" w:after="100" w:afterAutospacing="1" w:line="240" w:lineRule="auto"/>
         <w:rPr>
           <w:rFonts w:ascii="Arial" w:eastAsia="Times New Roman" w:hAnsi="Arial" w:cs="Arial"/>
           <w:i/>
@@ -57,7 +147,67 @@
           <w:lang w:eastAsia="en-IE"/>
           <w14:ligatures w14:val="none"/>
         </w:rPr>
-        <w:t>Data-Driven Insights for Inventory Optimization at Lotts &amp; Co. Clontarf</w:t>
+      </w:pPr>
+      <w:r>
+        <w:rPr>
+          <w:rFonts w:ascii="Arial" w:eastAsia="Times New Roman" w:hAnsi="Arial" w:cs="Arial"/>
+          <w:b/>
+          <w:bCs/>
+          <w:i/>
+          <w:iCs/>
+          <w:kern w:val="0"/>
+          <w:lang w:eastAsia="en-IE"/>
+          <w14:ligatures w14:val="none"/>
+        </w:rPr>
+        <w:t>analysing</w:t>
+      </w:r>
+      <w:r>
+        <w:rPr>
+          <w:rFonts w:ascii="Arial" w:eastAsia="Times New Roman" w:hAnsi="Arial" w:cs="Arial"/>
+          <w:b/>
+          <w:bCs/>
+          <w:i/>
+          <w:iCs/>
+          <w:kern w:val="0"/>
+          <w:lang w:eastAsia="en-IE"/>
+          <w14:ligatures w14:val="none"/>
+        </w:rPr>
+        <w:t xml:space="preserve"> stock movement, demand forecasting, and supplier coordination</w:t>
+      </w:r>
+      <w:r>
+        <w:rPr>
+          <w:rFonts w:ascii="Arial" w:eastAsia="Times New Roman" w:hAnsi="Arial" w:cs="Arial"/>
+          <w:i/>
+          <w:iCs/>
+          <w:kern w:val="0"/>
+          <w:lang w:eastAsia="en-IE"/>
+          <w14:ligatures w14:val="none"/>
+        </w:rPr>
+        <w:t xml:space="preserve"> aligns with the </w:t>
+      </w:r>
+      <w:r>
+        <w:rPr>
+          <w:rFonts w:ascii="Arial" w:eastAsia="Times New Roman" w:hAnsi="Arial" w:cs="Arial"/>
+          <w:b/>
+          <w:bCs/>
+          <w:i/>
+          <w:iCs/>
+          <w:kern w:val="0"/>
+          <w:lang w:eastAsia="en-IE"/>
+          <w14:ligatures w14:val="none"/>
+        </w:rPr>
+        <w:t>business/commercial focus</w:t>
+      </w:r>
+      <w:r>
+        <w:rPr>
+          <w:rFonts w:ascii="Arial" w:eastAsia="Times New Roman" w:hAnsi="Arial" w:cs="Arial"/>
+          <w:i/>
+          <w:iCs/>
+          <w:kern w:val="0"/>
+          <w:lang w:eastAsia="en-IE"/>
+          <w14:ligatures w14:val="none"/>
+        </w:rPr>
+        <w:t xml:space="preserve"> </w:t>
       </w:r>
     </w:p>
     <w:p>
@@ -66,6 +216,8 @@
         <w:spacing w:before="100" w:beforeAutospacing="1" w:after="100" w:afterAutospacing="1" w:line="240" w:lineRule="auto"/>
         <w:rPr>
           <w:rFonts w:ascii="Arial" w:eastAsia="Times New Roman" w:hAnsi="Arial" w:cs="Arial"/>
+          <w:i/>
+          <w:iCs/>
           <w:kern w:val="0"/>
           <w:lang w:eastAsia="en-IE"/>
           <w14:ligatures w14:val="none"/>
@@ -75,11 +227,12 @@
     <w:p>
       <w:pPr>
         <w:pStyle w:val="ListParagraph"/>
-        <w:spacing w:before="100" w:beforeAutospacing="1" w:after="100" w:afterAutospacing="1" w:line="240" w:lineRule="auto"/>
         <w:rPr>
           <w:rFonts w:ascii="Arial" w:eastAsia="Times New Roman" w:hAnsi="Arial" w:cs="Arial"/>
           <w:b/>
           <w:bCs/>
+          <w:i/>
+          <w:iCs/>
           <w:kern w:val="0"/>
           <w:lang w:eastAsia="en-IE"/>
           <w14:ligatures w14:val="none"/>
@@ -90,85 +243,52 @@
           <w:rFonts w:ascii="Arial" w:eastAsia="Times New Roman" w:hAnsi="Arial" w:cs="Arial"/>
           <w:b/>
           <w:bCs/>
-          <w:kern w:val="0"/>
-          <w:lang w:eastAsia="en-IE"/>
-          <w14:ligatures w14:val="none"/>
-        </w:rPr>
-        <w:t>strategic analysis</w:t>
-      </w:r>
-      <w:r>
-        <w:rPr>
-          <w:rFonts w:ascii="Arial" w:eastAsia="Times New Roman" w:hAnsi="Arial" w:cs="Arial"/>
-          <w:kern w:val="0"/>
-          <w:lang w:eastAsia="en-IE"/>
-          <w14:ligatures w14:val="none"/>
-        </w:rPr>
-        <w:t xml:space="preserve"> using </w:t>
+          <w:i/>
+          <w:iCs/>
+          <w:kern w:val="0"/>
+          <w:lang w:eastAsia="en-IE"/>
+          <w14:ligatures w14:val="none"/>
+        </w:rPr>
+        <w:t xml:space="preserve">Business Case </w:t>
       </w:r>
       <w:r>
         <w:rPr>
           <w:rFonts w:ascii="Arial" w:eastAsia="Times New Roman" w:hAnsi="Arial" w:cs="Arial"/>
           <w:b/>
           <w:bCs/>
-          <w:kern w:val="0"/>
-          <w:lang w:eastAsia="en-IE"/>
-          <w14:ligatures w14:val="none"/>
-        </w:rPr>
-        <w:t>data insights</w:t>
-      </w:r>
-    </w:p>
-    <w:p>
-      <w:pPr>
-        <w:pStyle w:val="ListParagraph"/>
-        <w:spacing w:before="100" w:beforeAutospacing="1" w:after="100" w:afterAutospacing="1" w:line="240" w:lineRule="auto"/>
+          <w:i/>
+          <w:iCs/>
+          <w:kern w:val="0"/>
+          <w:lang w:eastAsia="en-IE"/>
+          <w14:ligatures w14:val="none"/>
+        </w:rPr>
+        <w:t xml:space="preserve">- </w:t>
+      </w:r>
+      <w:r>
         <w:rPr>
           <w:rFonts w:ascii="Arial" w:eastAsia="Times New Roman" w:hAnsi="Arial" w:cs="Arial"/>
           <w:b/>
           <w:bCs/>
-          <w:kern w:val="0"/>
-          <w:lang w:eastAsia="en-IE"/>
-          <w14:ligatures w14:val="none"/>
-        </w:rPr>
-      </w:pPr>
+          <w:i/>
+          <w:iCs/>
+          <w:kern w:val="0"/>
+          <w:lang w:eastAsia="en-IE"/>
+          <w14:ligatures w14:val="none"/>
+        </w:rPr>
+        <w:t>Why This Matters to Lotts</w:t>
+      </w:r>
       <w:r>
         <w:rPr>
           <w:rFonts w:ascii="Arial" w:eastAsia="Times New Roman" w:hAnsi="Arial" w:cs="Arial"/>
           <w:b/>
           <w:bCs/>
-          <w:kern w:val="0"/>
-          <w:lang w:eastAsia="en-IE"/>
-          <w14:ligatures w14:val="none"/>
-        </w:rPr>
-        <w:t xml:space="preserve">predict </w:t>
-      </w:r>
-      <w:r>
-        <w:rPr>
-          <w:rFonts w:ascii="Arial" w:eastAsia="Times New Roman" w:hAnsi="Arial" w:cs="Arial"/>
-          <w:b/>
-          <w:bCs/>
-          <w:kern w:val="0"/>
-          <w:lang w:eastAsia="en-IE"/>
-          <w14:ligatures w14:val="none"/>
-        </w:rPr>
-        <w:t xml:space="preserve">demand </w:t>
-      </w:r>
-      <w:r>
-        <w:rPr>
-          <w:rFonts w:ascii="Arial" w:eastAsia="Times New Roman" w:hAnsi="Arial" w:cs="Arial"/>
-          <w:kern w:val="0"/>
-          <w:lang w:eastAsia="en-IE"/>
-          <w14:ligatures w14:val="none"/>
-        </w:rPr>
-        <w:t>and</w:t>
-      </w:r>
-      <w:r>
-        <w:rPr>
-          <w:rFonts w:ascii="Arial" w:eastAsia="Times New Roman" w:hAnsi="Arial" w:cs="Arial"/>
-          <w:kern w:val="0"/>
-          <w:lang w:eastAsia="en-IE"/>
-          <w14:ligatures w14:val="none"/>
-        </w:rPr>
-        <w:t xml:space="preserve"> recommendation to minimize stock shortages </w:t>
+          <w:i/>
+          <w:iCs/>
+          <w:kern w:val="0"/>
+          <w:lang w:eastAsia="en-IE"/>
+          <w14:ligatures w14:val="none"/>
+        </w:rPr>
+        <w:t>?</w:t>
       </w:r>
     </w:p>
     <w:p>
@@ -176,70 +296,15 @@
         <w:pStyle w:val="ListParagraph"/>
         <w:numPr>
           <w:ilvl w:val="0"/>
-          <w:numId w:val="15"/>
+          <w:numId w:val="18"/>
         </w:numPr>
-        <w:spacing w:before="100" w:beforeAutospacing="1" w:after="100" w:afterAutospacing="1" w:line="240" w:lineRule="auto"/>
-        <w:rPr>
-          <w:rFonts w:ascii="Arial" w:eastAsia="Times New Roman" w:hAnsi="Arial" w:cs="Arial"/>
-          <w:kern w:val="0"/>
-          <w:lang w:eastAsia="en-IE"/>
-          <w14:ligatures w14:val="none"/>
-        </w:rPr>
-      </w:pPr>
-      <w:r>
-        <w:rPr>
-          <w:rFonts w:ascii="Arial" w:eastAsia="Times New Roman" w:hAnsi="Arial" w:cs="Arial"/>
-          <w:kern w:val="0"/>
-          <w:lang w:eastAsia="en-IE"/>
-          <w14:ligatures w14:val="none"/>
-        </w:rPr>
-        <w:t xml:space="preserve">the finding will support decision-making rather than executing inventory changes </w:t>
-      </w:r>
-    </w:p>
-    <w:p>
-      <w:pPr>
-        <w:pStyle w:val="ListParagraph"/>
-        <w:spacing w:before="100" w:beforeAutospacing="1" w:after="100" w:afterAutospacing="1" w:line="240" w:lineRule="auto"/>
-        <w:rPr>
-          <w:rFonts w:ascii="Arial" w:eastAsia="Times New Roman" w:hAnsi="Arial" w:cs="Arial"/>
-          <w:kern w:val="0"/>
-          <w:lang w:eastAsia="en-IE"/>
-          <w14:ligatures w14:val="none"/>
-        </w:rPr>
-      </w:pPr>
-    </w:p>
-    <w:p>
-      <w:pPr>
-        <w:pStyle w:val="ListParagraph"/>
-        <w:spacing w:before="100" w:beforeAutospacing="1" w:after="100" w:afterAutospacing="1" w:line="240" w:lineRule="auto"/>
-        <w:rPr>
-          <w:rFonts w:ascii="Arial" w:eastAsia="Times New Roman" w:hAnsi="Arial" w:cs="Arial"/>
-          <w:kern w:val="0"/>
-          <w:lang w:eastAsia="en-IE"/>
-          <w14:ligatures w14:val="none"/>
-        </w:rPr>
-      </w:pPr>
-    </w:p>
-    <w:p>
-      <w:pPr>
-        <w:pStyle w:val="ListParagraph"/>
-        <w:spacing w:before="100" w:beforeAutospacing="1" w:after="100" w:afterAutospacing="1" w:line="240" w:lineRule="auto"/>
-        <w:rPr>
-          <w:rFonts w:ascii="Arial" w:eastAsia="Times New Roman" w:hAnsi="Arial" w:cs="Arial"/>
-          <w:kern w:val="0"/>
-          <w:lang w:eastAsia="en-IE"/>
-          <w14:ligatures w14:val="none"/>
-        </w:rPr>
-      </w:pPr>
-      <w:r>
-        <w:rPr>
-          <w:rFonts w:ascii="Arial" w:eastAsia="Times New Roman" w:hAnsi="Arial" w:cs="Arial"/>
-          <w:kern w:val="0"/>
-          <w:lang w:eastAsia="en-IE"/>
-          <w14:ligatures w14:val="none"/>
-        </w:rPr>
-        <w:t>While I don’t manage inventory, my analysis can provide actionable insights into optimising stock levels and reducing</w:t>
-      </w:r>
+        <w:rPr>
+          <w:rFonts w:ascii="Arial" w:eastAsia="Times New Roman" w:hAnsi="Arial" w:cs="Arial"/>
+          <w:kern w:val="0"/>
+          <w:lang w:eastAsia="en-IE"/>
+          <w14:ligatures w14:val="none"/>
+        </w:rPr>
+      </w:pPr>
       <w:r>
         <w:rPr>
           <w:rFonts w:ascii="Arial" w:eastAsia="Times New Roman" w:hAnsi="Arial" w:cs="Arial"/>
@@ -249,103 +314,27 @@
           <w:lang w:eastAsia="en-IE"/>
           <w14:ligatures w14:val="none"/>
         </w:rPr>
-        <w:t xml:space="preserve"> shortages</w:t>
-      </w:r>
-      <w:r>
-        <w:rPr>
-          <w:rFonts w:ascii="Arial" w:eastAsia="Times New Roman" w:hAnsi="Arial" w:cs="Arial"/>
-          <w:kern w:val="0"/>
-          <w:lang w:eastAsia="en-IE"/>
-          <w14:ligatures w14:val="none"/>
-        </w:rPr>
-        <w:t>.</w:t>
-      </w:r>
-    </w:p>
-    <w:p>
-      <w:pPr>
-        <w:pStyle w:val="ListParagraph"/>
-        <w:spacing w:before="100" w:beforeAutospacing="1" w:after="100" w:afterAutospacing="1" w:line="240" w:lineRule="auto"/>
-        <w:rPr>
-          <w:rFonts w:ascii="Arial" w:eastAsia="Times New Roman" w:hAnsi="Arial" w:cs="Arial"/>
-          <w:kern w:val="0"/>
-          <w:lang w:eastAsia="en-IE"/>
-          <w14:ligatures w14:val="none"/>
-        </w:rPr>
-      </w:pPr>
-    </w:p>
-    <w:p>
-      <w:pPr>
-        <w:spacing w:before="100" w:beforeAutospacing="1" w:after="100" w:afterAutospacing="1" w:line="240" w:lineRule="auto"/>
-        <w:rPr>
-          <w:rFonts w:ascii="Arial" w:eastAsia="Times New Roman" w:hAnsi="Arial" w:cs="Arial"/>
-          <w:kern w:val="0"/>
-          <w:lang w:eastAsia="en-IE"/>
-          <w14:ligatures w14:val="none"/>
-        </w:rPr>
-      </w:pPr>
-      <w:r>
-        <w:rPr>
-          <w:rFonts w:ascii="Arial" w:eastAsia="Times New Roman" w:hAnsi="Arial" w:cs="Arial"/>
-          <w:noProof/>
-          <w:kern w:val="0"/>
-          <w:lang w:eastAsia="en-IE"/>
-          <w14:ligatures w14:val="none"/>
-        </w:rPr>
-        <w:drawing>
-          <wp:inline distT="0" distB="0" distL="0" distR="0" wp14:anchorId="1470846B" wp14:editId="56A3F0B6">
-            <wp:extent cx="5731510" cy="1539240"/>
-            <wp:effectExtent l="0" t="0" r="2540" b="3810"/>
-            <wp:docPr id="1582810950" name="Picture 1" descr="A screenshot of a computer screen&#10;&#10;AI-generated content may be incorrect."/>
-            <wp:cNvGraphicFramePr>
-              <a:graphicFrameLocks xmlns:a="http://schemas.openxmlformats.org/drawingml/2006/main" noChangeAspect="1"/>
-            </wp:cNvGraphicFramePr>
-            <a:graphic xmlns:a="http://schemas.openxmlformats.org/drawingml/2006/main">
-              <a:graphicData uri="http://schemas.openxmlformats.org/drawingml/2006/picture">
-                <pic:pic xmlns:pic="http://schemas.openxmlformats.org/drawingml/2006/picture">
-                  <pic:nvPicPr>
-                    <pic:cNvPr id="1582810950" name="Picture 1" descr="A screenshot of a computer screen&#10;&#10;AI-generated content may be incorrect."/>
-                    <pic:cNvPicPr/>
-                  </pic:nvPicPr>
-                  <pic:blipFill>
-                    <a:blip r:embed="rId5"/>
-                    <a:stretch>
-                      <a:fillRect/>
-                    </a:stretch>
-                  </pic:blipFill>
-                  <pic:spPr>
-                    <a:xfrm>
-                      <a:off x="0" y="0"/>
-                      <a:ext cx="5731510" cy="1539240"/>
-                    </a:xfrm>
-                    <a:prstGeom prst="rect">
-                      <a:avLst/>
-                    </a:prstGeom>
-                  </pic:spPr>
-                </pic:pic>
-              </a:graphicData>
-            </a:graphic>
-          </wp:inline>
-        </w:drawing>
-      </w:r>
-    </w:p>
-    <w:p>
-      <w:pPr>
-        <w:spacing w:before="100" w:beforeAutospacing="1" w:after="100" w:afterAutospacing="1" w:line="240" w:lineRule="auto"/>
-        <w:rPr>
-          <w:rFonts w:ascii="Arial" w:eastAsia="Times New Roman" w:hAnsi="Arial" w:cs="Arial"/>
-          <w:kern w:val="0"/>
-          <w:lang w:eastAsia="en-IE"/>
-          <w14:ligatures w14:val="none"/>
-        </w:rPr>
-      </w:pPr>
-      <w:r>
-        <w:rPr>
-          <w:rFonts w:ascii="Arial" w:eastAsia="Times New Roman" w:hAnsi="Arial" w:cs="Arial"/>
-          <w:kern w:val="0"/>
-          <w:lang w:eastAsia="en-IE"/>
-          <w14:ligatures w14:val="none"/>
-        </w:rPr>
-        <w:t xml:space="preserve">INTRODUCTION </w:t>
+        <w:t>Business</w:t>
+      </w:r>
+      <w:r>
+        <w:rPr>
+          <w:rFonts w:ascii="Arial" w:eastAsia="Times New Roman" w:hAnsi="Arial" w:cs="Arial"/>
+          <w:b/>
+          <w:bCs/>
+          <w:kern w:val="0"/>
+          <w:lang w:eastAsia="en-IE"/>
+          <w14:ligatures w14:val="none"/>
+        </w:rPr>
+        <w:t xml:space="preserve"> Impact:</w:t>
+      </w:r>
+      <w:r>
+        <w:rPr>
+          <w:rFonts w:ascii="Arial" w:eastAsia="Times New Roman" w:hAnsi="Arial" w:cs="Arial"/>
+          <w:kern w:val="0"/>
+          <w:lang w:eastAsia="en-IE"/>
+          <w14:ligatures w14:val="none"/>
+        </w:rPr>
+        <w:t xml:space="preserve"> Helps prevent stock shortages &amp; optimize ordering.</w:t>
       </w:r>
     </w:p>
     <w:p>
@@ -353,24 +342,34 @@
         <w:pStyle w:val="ListParagraph"/>
         <w:numPr>
           <w:ilvl w:val="0"/>
-          <w:numId w:val="15"/>
+          <w:numId w:val="18"/>
         </w:numPr>
-        <w:spacing w:before="100" w:beforeAutospacing="1" w:after="100" w:afterAutospacing="1" w:line="240" w:lineRule="auto"/>
-        <w:rPr>
-          <w:rFonts w:ascii="Arial" w:eastAsia="Times New Roman" w:hAnsi="Arial" w:cs="Arial"/>
-          <w:kern w:val="0"/>
-          <w:lang w:eastAsia="en-IE"/>
-          <w14:ligatures w14:val="none"/>
-        </w:rPr>
-      </w:pPr>
-      <w:r>
-        <w:rPr>
-          <w:rFonts w:ascii="Arial" w:eastAsia="Times New Roman" w:hAnsi="Arial" w:cs="Arial"/>
-          <w:kern w:val="0"/>
-          <w:lang w:eastAsia="en-IE"/>
-          <w14:ligatures w14:val="none"/>
-        </w:rPr>
-        <w:t xml:space="preserve">Goal/ purpose </w:t>
+        <w:rPr>
+          <w:rFonts w:ascii="Arial" w:eastAsia="Times New Roman" w:hAnsi="Arial" w:cs="Arial"/>
+          <w:kern w:val="0"/>
+          <w:lang w:eastAsia="en-IE"/>
+          <w14:ligatures w14:val="none"/>
+        </w:rPr>
+      </w:pPr>
+      <w:r>
+        <w:rPr>
+          <w:rFonts w:ascii="Arial" w:eastAsia="Times New Roman" w:hAnsi="Arial" w:cs="Arial"/>
+          <w:b/>
+          <w:bCs/>
+          <w:kern w:val="0"/>
+          <w:lang w:eastAsia="en-IE"/>
+          <w14:ligatures w14:val="none"/>
+        </w:rPr>
+        <w:t>Competitive Advantage:</w:t>
+      </w:r>
+      <w:r>
+        <w:rPr>
+          <w:rFonts w:ascii="Arial" w:eastAsia="Times New Roman" w:hAnsi="Arial" w:cs="Arial"/>
+          <w:kern w:val="0"/>
+          <w:lang w:eastAsia="en-IE"/>
+          <w14:ligatures w14:val="none"/>
+        </w:rPr>
+        <w:t xml:space="preserve"> Better supplier coordination = fewer stockouts &amp; increased sales.</w:t>
       </w:r>
     </w:p>
     <w:p>
@@ -378,42 +377,87 @@
         <w:pStyle w:val="ListParagraph"/>
         <w:numPr>
           <w:ilvl w:val="0"/>
-          <w:numId w:val="15"/>
+          <w:numId w:val="18"/>
         </w:numPr>
-        <w:spacing w:before="100" w:beforeAutospacing="1" w:after="100" w:afterAutospacing="1" w:line="240" w:lineRule="auto"/>
-        <w:rPr>
-          <w:rFonts w:ascii="Arial" w:eastAsia="Times New Roman" w:hAnsi="Arial" w:cs="Arial"/>
-          <w:kern w:val="0"/>
-          <w:lang w:eastAsia="en-IE"/>
-          <w14:ligatures w14:val="none"/>
-        </w:rPr>
-      </w:pPr>
-      <w:r>
-        <w:rPr>
-          <w:rFonts w:ascii="Arial" w:eastAsia="Times New Roman" w:hAnsi="Arial" w:cs="Arial"/>
-          <w:kern w:val="0"/>
-          <w:lang w:eastAsia="en-IE"/>
-          <w14:ligatures w14:val="none"/>
-        </w:rPr>
-        <w:t xml:space="preserve">Clarifying that the focus is on analysing sales data to predict </w:t>
-      </w:r>
-      <w:r>
-        <w:rPr>
-          <w:rFonts w:ascii="Arial" w:eastAsia="Times New Roman" w:hAnsi="Arial" w:cs="Arial"/>
-          <w:kern w:val="0"/>
-          <w:lang w:eastAsia="en-IE"/>
-          <w14:ligatures w14:val="none"/>
-        </w:rPr>
-        <w:t>demand, not</w:t>
-      </w:r>
-      <w:r>
-        <w:rPr>
-          <w:rFonts w:ascii="Arial" w:eastAsia="Times New Roman" w:hAnsi="Arial" w:cs="Arial"/>
-          <w:kern w:val="0"/>
-          <w:lang w:eastAsia="en-IE"/>
-          <w14:ligatures w14:val="none"/>
-        </w:rPr>
-        <w:t xml:space="preserve"> on direct inventory control.</w:t>
+        <w:rPr>
+          <w:rFonts w:ascii="Arial" w:eastAsia="Times New Roman" w:hAnsi="Arial" w:cs="Arial"/>
+          <w:kern w:val="0"/>
+          <w:lang w:eastAsia="en-IE"/>
+          <w14:ligatures w14:val="none"/>
+        </w:rPr>
+      </w:pPr>
+      <w:r>
+        <w:rPr>
+          <w:rFonts w:ascii="Arial" w:eastAsia="Times New Roman" w:hAnsi="Arial" w:cs="Arial"/>
+          <w:b/>
+          <w:bCs/>
+          <w:kern w:val="0"/>
+          <w:lang w:eastAsia="en-IE"/>
+          <w14:ligatures w14:val="none"/>
+        </w:rPr>
+        <w:t>Strategic Focus:</w:t>
+      </w:r>
+      <w:r>
+        <w:rPr>
+          <w:rFonts w:ascii="Arial" w:eastAsia="Times New Roman" w:hAnsi="Arial" w:cs="Arial"/>
+          <w:kern w:val="0"/>
+          <w:lang w:eastAsia="en-IE"/>
+          <w14:ligatures w14:val="none"/>
+        </w:rPr>
+        <w:t xml:space="preserve"> </w:t>
+      </w:r>
+      <w:r>
+        <w:rPr>
+          <w:rFonts w:ascii="Arial" w:eastAsia="Times New Roman" w:hAnsi="Arial" w:cs="Arial"/>
+          <w:kern w:val="0"/>
+          <w:lang w:eastAsia="en-IE"/>
+          <w14:ligatures w14:val="none"/>
+        </w:rPr>
+        <w:t>This is</w:t>
+      </w:r>
+      <w:r>
+        <w:rPr>
+          <w:rFonts w:ascii="Arial" w:eastAsia="Times New Roman" w:hAnsi="Arial" w:cs="Arial"/>
+          <w:kern w:val="0"/>
+          <w:lang w:eastAsia="en-IE"/>
+          <w14:ligatures w14:val="none"/>
+        </w:rPr>
+        <w:t xml:space="preserve"> about decision-making using data analytics, NOT just tracking inventory.</w:t>
+      </w:r>
+    </w:p>
+    <w:p>
+      <w:pPr>
+        <w:pStyle w:val="ListParagraph"/>
+        <w:rPr>
+          <w:rFonts w:ascii="Arial" w:eastAsia="Times New Roman" w:hAnsi="Arial" w:cs="Arial"/>
+          <w:b/>
+          <w:bCs/>
+          <w:kern w:val="0"/>
+          <w:lang w:eastAsia="en-IE"/>
+          <w14:ligatures w14:val="none"/>
+        </w:rPr>
+      </w:pPr>
+    </w:p>
+    <w:p>
+      <w:pPr>
+        <w:pStyle w:val="ListParagraph"/>
+        <w:rPr>
+          <w:rFonts w:ascii="Arial" w:eastAsia="Times New Roman" w:hAnsi="Arial" w:cs="Arial"/>
+          <w:kern w:val="0"/>
+          <w:lang w:eastAsia="en-IE"/>
+          <w14:ligatures w14:val="none"/>
+        </w:rPr>
+      </w:pPr>
+      <w:r>
+        <w:rPr>
+          <w:rFonts w:ascii="Arial" w:eastAsia="Times New Roman" w:hAnsi="Arial" w:cs="Arial"/>
+          <w:b/>
+          <w:bCs/>
+          <w:kern w:val="0"/>
+          <w:lang w:eastAsia="en-IE"/>
+          <w14:ligatures w14:val="none"/>
+        </w:rPr>
+        <w:t>Key Insights from the Report:</w:t>
       </w:r>
     </w:p>
     <w:p>
@@ -421,36 +465,34 @@
         <w:pStyle w:val="ListParagraph"/>
         <w:numPr>
           <w:ilvl w:val="0"/>
-          <w:numId w:val="15"/>
+          <w:numId w:val="22"/>
         </w:numPr>
-        <w:spacing w:before="100" w:beforeAutospacing="1" w:after="100" w:afterAutospacing="1" w:line="240" w:lineRule="auto"/>
-      </w:pPr>
-      <w:r>
-        <w:rPr>
+        <w:rPr>
+          <w:rFonts w:ascii="Arial" w:eastAsia="Times New Roman" w:hAnsi="Arial" w:cs="Arial"/>
+          <w:kern w:val="0"/>
+          <w:lang w:eastAsia="en-IE"/>
+          <w14:ligatures w14:val="none"/>
+        </w:rPr>
+      </w:pPr>
+      <w:r>
+        <w:rPr>
+          <w:rFonts w:ascii="Arial" w:eastAsia="Times New Roman" w:hAnsi="Arial" w:cs="Arial"/>
           <w:b/>
           <w:bCs/>
-        </w:rPr>
-        <w:t xml:space="preserve">Business Context </w:t>
-      </w:r>
-      <w:r>
-        <w:t>describes</w:t>
-      </w:r>
-      <w:r>
-        <w:t xml:space="preserve"> Lotts &amp; Co</w:t>
-      </w:r>
-      <w:r>
-        <w:t xml:space="preserve"> </w:t>
-      </w:r>
-      <w:r>
-        <w:t>and the challenge of stock shortages.</w:t>
-      </w:r>
-    </w:p>
-    <w:p>
-      <w:pPr>
-        <w:spacing w:before="100" w:beforeAutospacing="1" w:after="100" w:afterAutospacing="1" w:line="240" w:lineRule="auto"/>
-      </w:pPr>
-      <w:r>
-        <w:t xml:space="preserve">PROJECT CONCEPT </w:t>
+          <w:kern w:val="0"/>
+          <w:lang w:eastAsia="en-IE"/>
+          <w14:ligatures w14:val="none"/>
+        </w:rPr>
+        <w:t>High-Demand Wines:</w:t>
+      </w:r>
+      <w:r>
+        <w:rPr>
+          <w:rFonts w:ascii="Arial" w:eastAsia="Times New Roman" w:hAnsi="Arial" w:cs="Arial"/>
+          <w:kern w:val="0"/>
+          <w:lang w:eastAsia="en-IE"/>
+          <w14:ligatures w14:val="none"/>
+        </w:rPr>
+        <w:t xml:space="preserve"> Some wines consistently sell out, leading to lost sales.</w:t>
       </w:r>
     </w:p>
     <w:p>
@@ -458,32 +500,34 @@
         <w:pStyle w:val="ListParagraph"/>
         <w:numPr>
           <w:ilvl w:val="0"/>
-          <w:numId w:val="16"/>
+          <w:numId w:val="22"/>
         </w:numPr>
-        <w:spacing w:before="100" w:beforeAutospacing="1" w:after="100" w:afterAutospacing="1" w:line="240" w:lineRule="auto"/>
-      </w:pPr>
-      <w:r>
-        <w:t xml:space="preserve">Problem: </w:t>
-      </w:r>
-      <w:r>
-        <w:t xml:space="preserve">issues on stock shortages and how it </w:t>
-      </w:r>
-      <w:r>
-        <w:t>impact</w:t>
-      </w:r>
-      <w:r>
-        <w:t xml:space="preserve"> sales and customer satisfaction</w:t>
-      </w:r>
-    </w:p>
-    <w:p>
-      <w:pPr>
-        <w:spacing w:before="100" w:beforeAutospacing="1" w:after="100" w:afterAutospacing="1" w:line="240" w:lineRule="auto"/>
-      </w:pPr>
-      <w:r>
-        <w:t>BUSINESS ANALYSIS METHOD</w:t>
-      </w:r>
-      <w:r>
-        <w:t xml:space="preserve"> </w:t>
+        <w:rPr>
+          <w:rFonts w:ascii="Arial" w:eastAsia="Times New Roman" w:hAnsi="Arial" w:cs="Arial"/>
+          <w:kern w:val="0"/>
+          <w:lang w:eastAsia="en-IE"/>
+          <w14:ligatures w14:val="none"/>
+        </w:rPr>
+      </w:pPr>
+      <w:r>
+        <w:rPr>
+          <w:rFonts w:ascii="Arial" w:eastAsia="Times New Roman" w:hAnsi="Arial" w:cs="Arial"/>
+          <w:b/>
+          <w:bCs/>
+          <w:kern w:val="0"/>
+          <w:lang w:eastAsia="en-IE"/>
+          <w14:ligatures w14:val="none"/>
+        </w:rPr>
+        <w:t>Slow-Moving Wines:</w:t>
+      </w:r>
+      <w:r>
+        <w:rPr>
+          <w:rFonts w:ascii="Arial" w:eastAsia="Times New Roman" w:hAnsi="Arial" w:cs="Arial"/>
+          <w:kern w:val="0"/>
+          <w:lang w:eastAsia="en-IE"/>
+          <w14:ligatures w14:val="none"/>
+        </w:rPr>
+        <w:t xml:space="preserve"> Certain wines are selling poorly, leading to excess inventory.</w:t>
       </w:r>
     </w:p>
     <w:p>
@@ -491,65 +535,1248 @@
         <w:pStyle w:val="ListParagraph"/>
         <w:numPr>
           <w:ilvl w:val="0"/>
-          <w:numId w:val="16"/>
+          <w:numId w:val="22"/>
+        </w:numPr>
+        <w:rPr>
+          <w:rFonts w:ascii="Arial" w:eastAsia="Times New Roman" w:hAnsi="Arial" w:cs="Arial"/>
+          <w:kern w:val="0"/>
+          <w:lang w:eastAsia="en-IE"/>
+          <w14:ligatures w14:val="none"/>
+        </w:rPr>
+      </w:pPr>
+      <w:r>
+        <w:rPr>
+          <w:rFonts w:ascii="Arial" w:eastAsia="Times New Roman" w:hAnsi="Arial" w:cs="Arial"/>
+          <w:b/>
+          <w:bCs/>
+          <w:kern w:val="0"/>
+          <w:lang w:eastAsia="en-IE"/>
+          <w14:ligatures w14:val="none"/>
+        </w:rPr>
+        <w:t>Seasonal Trends:</w:t>
+      </w:r>
+      <w:r>
+        <w:rPr>
+          <w:rFonts w:ascii="Arial" w:eastAsia="Times New Roman" w:hAnsi="Arial" w:cs="Arial"/>
+          <w:kern w:val="0"/>
+          <w:lang w:eastAsia="en-IE"/>
+          <w14:ligatures w14:val="none"/>
+        </w:rPr>
+        <w:t xml:space="preserve"> Weekends and special events (</w:t>
+      </w:r>
+      <w:r>
+        <w:rPr>
+          <w:rFonts w:ascii="Arial" w:eastAsia="Times New Roman" w:hAnsi="Arial" w:cs="Arial"/>
+          <w:kern w:val="0"/>
+          <w:lang w:eastAsia="en-IE"/>
+          <w14:ligatures w14:val="none"/>
+        </w:rPr>
+        <w:t>example</w:t>
+      </w:r>
+      <w:r>
+        <w:rPr>
+          <w:rFonts w:ascii="Arial" w:eastAsia="Times New Roman" w:hAnsi="Arial" w:cs="Arial"/>
+          <w:kern w:val="0"/>
+          <w:lang w:eastAsia="en-IE"/>
+          <w14:ligatures w14:val="none"/>
+        </w:rPr>
+        <w:t>, Valentine’s Day</w:t>
+      </w:r>
+      <w:r>
+        <w:rPr>
+          <w:rFonts w:ascii="Arial" w:eastAsia="Times New Roman" w:hAnsi="Arial" w:cs="Arial"/>
+          <w:kern w:val="0"/>
+          <w:lang w:eastAsia="en-IE"/>
+          <w14:ligatures w14:val="none"/>
+        </w:rPr>
+        <w:t>, weekends</w:t>
+      </w:r>
+      <w:r>
+        <w:rPr>
+          <w:rFonts w:ascii="Arial" w:eastAsia="Times New Roman" w:hAnsi="Arial" w:cs="Arial"/>
+          <w:kern w:val="0"/>
+          <w:lang w:eastAsia="en-IE"/>
+          <w14:ligatures w14:val="none"/>
+        </w:rPr>
+        <w:t>) see demand spikes.</w:t>
+      </w:r>
+    </w:p>
+    <w:p>
+      <w:pPr>
+        <w:rPr>
+          <w:rFonts w:ascii="Arial" w:eastAsia="Times New Roman" w:hAnsi="Arial" w:cs="Arial"/>
+          <w:kern w:val="0"/>
+          <w:lang w:eastAsia="en-IE"/>
+          <w14:ligatures w14:val="none"/>
+        </w:rPr>
+      </w:pPr>
+    </w:p>
+    <w:p>
+      <w:pPr>
+        <w:pStyle w:val="ListParagraph"/>
+        <w:rPr>
+          <w:rFonts w:ascii="Arial" w:eastAsia="Times New Roman" w:hAnsi="Arial" w:cs="Arial"/>
+          <w:kern w:val="0"/>
+          <w:lang w:eastAsia="en-IE"/>
+          <w14:ligatures w14:val="none"/>
+        </w:rPr>
+      </w:pPr>
+      <w:r>
+        <w:rPr>
+          <w:rFonts w:ascii="Arial" w:eastAsia="Times New Roman" w:hAnsi="Arial" w:cs="Arial"/>
+          <w:b/>
+          <w:bCs/>
+          <w:kern w:val="0"/>
+          <w:lang w:eastAsia="en-IE"/>
+          <w14:ligatures w14:val="none"/>
+        </w:rPr>
+        <w:t xml:space="preserve">How </w:t>
+      </w:r>
+      <w:r>
+        <w:rPr>
+          <w:rFonts w:ascii="Arial" w:eastAsia="Times New Roman" w:hAnsi="Arial" w:cs="Arial"/>
+          <w:b/>
+          <w:bCs/>
+          <w:kern w:val="0"/>
+          <w:lang w:eastAsia="en-IE"/>
+          <w14:ligatures w14:val="none"/>
+        </w:rPr>
+        <w:t>Was the Data</w:t>
+      </w:r>
+      <w:r>
+        <w:rPr>
+          <w:rFonts w:ascii="Arial" w:eastAsia="Times New Roman" w:hAnsi="Arial" w:cs="Arial"/>
+          <w:b/>
+          <w:bCs/>
+          <w:kern w:val="0"/>
+          <w:lang w:eastAsia="en-IE"/>
+          <w14:ligatures w14:val="none"/>
+        </w:rPr>
+        <w:t xml:space="preserve"> </w:t>
+      </w:r>
+      <w:r>
+        <w:rPr>
+          <w:rFonts w:ascii="Arial" w:eastAsia="Times New Roman" w:hAnsi="Arial" w:cs="Arial"/>
+          <w:b/>
+          <w:bCs/>
+          <w:kern w:val="0"/>
+          <w:lang w:eastAsia="en-IE"/>
+          <w14:ligatures w14:val="none"/>
+        </w:rPr>
+        <w:t>Analysed</w:t>
+      </w:r>
+      <w:r>
+        <w:rPr>
+          <w:rFonts w:ascii="Arial" w:eastAsia="Times New Roman" w:hAnsi="Arial" w:cs="Arial"/>
+          <w:b/>
+          <w:bCs/>
+          <w:kern w:val="0"/>
+          <w:lang w:eastAsia="en-IE"/>
+          <w14:ligatures w14:val="none"/>
+        </w:rPr>
+        <w:t>?</w:t>
+      </w:r>
+    </w:p>
+    <w:p>
+      <w:pPr>
+        <w:pStyle w:val="ListParagraph"/>
+        <w:numPr>
+          <w:ilvl w:val="0"/>
+          <w:numId w:val="23"/>
+        </w:numPr>
+        <w:rPr>
+          <w:rFonts w:ascii="Arial" w:eastAsia="Times New Roman" w:hAnsi="Arial" w:cs="Arial"/>
+          <w:kern w:val="0"/>
+          <w:lang w:eastAsia="en-IE"/>
+          <w14:ligatures w14:val="none"/>
+        </w:rPr>
+      </w:pPr>
+      <w:r>
+        <w:rPr>
+          <w:rFonts w:ascii="Arial" w:eastAsia="Times New Roman" w:hAnsi="Arial" w:cs="Arial"/>
+          <w:b/>
+          <w:bCs/>
+          <w:kern w:val="0"/>
+          <w:lang w:eastAsia="en-IE"/>
+          <w14:ligatures w14:val="none"/>
+        </w:rPr>
+        <w:t>Stock Movement Trends:</w:t>
+      </w:r>
+      <w:r>
+        <w:rPr>
+          <w:rFonts w:ascii="Arial" w:eastAsia="Times New Roman" w:hAnsi="Arial" w:cs="Arial"/>
+          <w:kern w:val="0"/>
+          <w:lang w:eastAsia="en-IE"/>
+          <w14:ligatures w14:val="none"/>
+        </w:rPr>
+        <w:t xml:space="preserve"> Which wines sell out fastest?</w:t>
+      </w:r>
+    </w:p>
+    <w:p>
+      <w:pPr>
+        <w:pStyle w:val="ListParagraph"/>
+        <w:numPr>
+          <w:ilvl w:val="0"/>
+          <w:numId w:val="23"/>
+        </w:numPr>
+        <w:rPr>
+          <w:rFonts w:ascii="Arial" w:eastAsia="Times New Roman" w:hAnsi="Arial" w:cs="Arial"/>
+          <w:kern w:val="0"/>
+          <w:lang w:eastAsia="en-IE"/>
+          <w14:ligatures w14:val="none"/>
+        </w:rPr>
+      </w:pPr>
+      <w:r>
+        <w:rPr>
+          <w:rFonts w:ascii="Arial" w:eastAsia="Times New Roman" w:hAnsi="Arial" w:cs="Arial"/>
+          <w:b/>
+          <w:bCs/>
+          <w:kern w:val="0"/>
+          <w:lang w:eastAsia="en-IE"/>
+          <w14:ligatures w14:val="none"/>
+        </w:rPr>
+        <w:t>Sales Frequency Analysis:</w:t>
+      </w:r>
+      <w:r>
+        <w:rPr>
+          <w:rFonts w:ascii="Arial" w:eastAsia="Times New Roman" w:hAnsi="Arial" w:cs="Arial"/>
+          <w:kern w:val="0"/>
+          <w:lang w:eastAsia="en-IE"/>
+          <w14:ligatures w14:val="none"/>
+        </w:rPr>
+        <w:t xml:space="preserve"> Daily/weekly wine sales patterns.</w:t>
+      </w:r>
+    </w:p>
+    <w:p>
+      <w:pPr>
+        <w:pStyle w:val="ListParagraph"/>
+        <w:numPr>
+          <w:ilvl w:val="0"/>
+          <w:numId w:val="23"/>
+        </w:numPr>
+        <w:rPr>
+          <w:rFonts w:ascii="Arial" w:eastAsia="Times New Roman" w:hAnsi="Arial" w:cs="Arial"/>
+          <w:kern w:val="0"/>
+          <w:lang w:eastAsia="en-IE"/>
+          <w14:ligatures w14:val="none"/>
+        </w:rPr>
+      </w:pPr>
+      <w:r>
+        <w:rPr>
+          <w:rFonts w:ascii="Arial" w:eastAsia="Times New Roman" w:hAnsi="Arial" w:cs="Arial"/>
+          <w:b/>
+          <w:bCs/>
+          <w:kern w:val="0"/>
+          <w:lang w:eastAsia="en-IE"/>
+          <w14:ligatures w14:val="none"/>
+        </w:rPr>
+        <w:t>Stockout Trends:</w:t>
+      </w:r>
+      <w:r>
+        <w:rPr>
+          <w:rFonts w:ascii="Arial" w:eastAsia="Times New Roman" w:hAnsi="Arial" w:cs="Arial"/>
+          <w:kern w:val="0"/>
+          <w:lang w:eastAsia="en-IE"/>
+          <w14:ligatures w14:val="none"/>
+        </w:rPr>
+        <w:t xml:space="preserve"> How often are wines selling out?</w:t>
+      </w:r>
+    </w:p>
+    <w:p>
+      <w:pPr>
+        <w:pStyle w:val="ListParagraph"/>
+        <w:rPr>
+          <w:rFonts w:ascii="Arial" w:eastAsia="Times New Roman" w:hAnsi="Arial" w:cs="Arial"/>
+          <w:kern w:val="0"/>
+          <w:lang w:eastAsia="en-IE"/>
+          <w14:ligatures w14:val="none"/>
+        </w:rPr>
+      </w:pPr>
+    </w:p>
+    <w:p>
+      <w:pPr>
+        <w:rPr>
+          <w:rFonts w:ascii="Arial" w:eastAsia="Times New Roman" w:hAnsi="Arial" w:cs="Arial"/>
+          <w:b/>
+          <w:bCs/>
+          <w:kern w:val="0"/>
+          <w:lang w:eastAsia="en-IE"/>
+          <w14:ligatures w14:val="none"/>
+        </w:rPr>
+      </w:pPr>
+    </w:p>
+    <w:p>
+      <w:pPr>
+        <w:rPr>
+          <w:rFonts w:ascii="Arial" w:eastAsia="Times New Roman" w:hAnsi="Arial" w:cs="Arial"/>
+          <w:kern w:val="0"/>
+          <w:lang w:eastAsia="en-IE"/>
+          <w14:ligatures w14:val="none"/>
+        </w:rPr>
+      </w:pPr>
+      <w:r>
+        <w:rPr>
+          <w:rFonts w:ascii="Arial" w:eastAsia="Times New Roman" w:hAnsi="Arial" w:cs="Arial"/>
+          <w:b/>
+          <w:bCs/>
+          <w:kern w:val="0"/>
+          <w:lang w:eastAsia="en-IE"/>
+          <w14:ligatures w14:val="none"/>
+        </w:rPr>
+        <w:t>Business Analysis Method: SWOT Analysis</w:t>
+      </w:r>
+      <w:r>
+        <w:rPr>
+          <w:rFonts w:ascii="Arial" w:eastAsia="Times New Roman" w:hAnsi="Arial" w:cs="Arial"/>
+          <w:b/>
+          <w:bCs/>
+          <w:kern w:val="0"/>
+          <w:lang w:eastAsia="en-IE"/>
+          <w14:ligatures w14:val="none"/>
+        </w:rPr>
+        <w:t xml:space="preserve"> - </w:t>
+      </w:r>
+      <w:r>
+        <w:rPr>
+          <w:rFonts w:ascii="Arial" w:eastAsia="Times New Roman" w:hAnsi="Arial" w:cs="Arial"/>
+          <w:kern w:val="0"/>
+          <w:lang w:eastAsia="en-IE"/>
+          <w14:ligatures w14:val="none"/>
+        </w:rPr>
+        <w:t xml:space="preserve">identify areas for improvement </w:t>
+      </w:r>
+    </w:p>
+    <w:p>
+      <w:pPr>
+        <w:rPr>
+          <w:rFonts w:ascii="Arial" w:eastAsia="Times New Roman" w:hAnsi="Arial" w:cs="Arial"/>
+          <w:kern w:val="0"/>
+          <w:lang w:eastAsia="en-IE"/>
+          <w14:ligatures w14:val="none"/>
+        </w:rPr>
+      </w:pPr>
+      <w:r>
+        <w:rPr>
+          <w:rFonts w:ascii="Arial" w:eastAsia="Times New Roman" w:hAnsi="Arial" w:cs="Arial"/>
+          <w:b/>
+          <w:bCs/>
+          <w:kern w:val="0"/>
+          <w:lang w:eastAsia="en-IE"/>
+          <w14:ligatures w14:val="none"/>
+        </w:rPr>
+        <w:t>How SWOT helps in your project:</w:t>
+      </w:r>
+    </w:p>
+    <w:p>
+      <w:pPr>
+        <w:numPr>
+          <w:ilvl w:val="0"/>
+          <w:numId w:val="19"/>
+        </w:numPr>
+        <w:rPr>
+          <w:rFonts w:ascii="Arial" w:eastAsia="Times New Roman" w:hAnsi="Arial" w:cs="Arial"/>
+          <w:kern w:val="0"/>
+          <w:lang w:eastAsia="en-IE"/>
+          <w14:ligatures w14:val="none"/>
+        </w:rPr>
+      </w:pPr>
+      <w:r>
+        <w:rPr>
+          <w:rFonts w:ascii="Arial" w:eastAsia="Times New Roman" w:hAnsi="Arial" w:cs="Arial"/>
+          <w:b/>
+          <w:bCs/>
+          <w:kern w:val="0"/>
+          <w:lang w:eastAsia="en-IE"/>
+          <w14:ligatures w14:val="none"/>
+        </w:rPr>
+        <w:t>Strengths:</w:t>
+      </w:r>
+      <w:r>
+        <w:rPr>
+          <w:rFonts w:ascii="Arial" w:eastAsia="Times New Roman" w:hAnsi="Arial" w:cs="Arial"/>
+          <w:kern w:val="0"/>
+          <w:lang w:eastAsia="en-IE"/>
+          <w14:ligatures w14:val="none"/>
+        </w:rPr>
+        <w:t xml:space="preserve"> Identifying best-selling wines.</w:t>
+      </w:r>
+    </w:p>
+    <w:p>
+      <w:pPr>
+        <w:numPr>
+          <w:ilvl w:val="0"/>
+          <w:numId w:val="19"/>
+        </w:numPr>
+        <w:rPr>
+          <w:rFonts w:ascii="Arial" w:eastAsia="Times New Roman" w:hAnsi="Arial" w:cs="Arial"/>
+          <w:kern w:val="0"/>
+          <w:lang w:eastAsia="en-IE"/>
+          <w14:ligatures w14:val="none"/>
+        </w:rPr>
+      </w:pPr>
+      <w:r>
+        <w:rPr>
+          <w:rFonts w:ascii="Arial" w:eastAsia="Times New Roman" w:hAnsi="Arial" w:cs="Arial"/>
+          <w:b/>
+          <w:bCs/>
+          <w:kern w:val="0"/>
+          <w:lang w:eastAsia="en-IE"/>
+          <w14:ligatures w14:val="none"/>
+        </w:rPr>
+        <w:t>Weaknesses:</w:t>
+      </w:r>
+      <w:r>
+        <w:rPr>
+          <w:rFonts w:ascii="Arial" w:eastAsia="Times New Roman" w:hAnsi="Arial" w:cs="Arial"/>
+          <w:kern w:val="0"/>
+          <w:lang w:eastAsia="en-IE"/>
+          <w14:ligatures w14:val="none"/>
+        </w:rPr>
+        <w:t xml:space="preserve"> Frequent stock shortages.</w:t>
+      </w:r>
+    </w:p>
+    <w:p>
+      <w:pPr>
+        <w:numPr>
+          <w:ilvl w:val="0"/>
+          <w:numId w:val="19"/>
+        </w:numPr>
+        <w:rPr>
+          <w:rFonts w:ascii="Arial" w:eastAsia="Times New Roman" w:hAnsi="Arial" w:cs="Arial"/>
+          <w:kern w:val="0"/>
+          <w:lang w:eastAsia="en-IE"/>
+          <w14:ligatures w14:val="none"/>
+        </w:rPr>
+      </w:pPr>
+      <w:r>
+        <w:rPr>
+          <w:rFonts w:ascii="Arial" w:eastAsia="Times New Roman" w:hAnsi="Arial" w:cs="Arial"/>
+          <w:b/>
+          <w:bCs/>
+          <w:kern w:val="0"/>
+          <w:lang w:eastAsia="en-IE"/>
+          <w14:ligatures w14:val="none"/>
+        </w:rPr>
+        <w:t>Opportunities:</w:t>
+      </w:r>
+      <w:r>
+        <w:rPr>
+          <w:rFonts w:ascii="Arial" w:eastAsia="Times New Roman" w:hAnsi="Arial" w:cs="Arial"/>
+          <w:kern w:val="0"/>
+          <w:lang w:eastAsia="en-IE"/>
+          <w14:ligatures w14:val="none"/>
+        </w:rPr>
+        <w:t xml:space="preserve"> Predicting peak demand &amp; optimizing supplier orders.</w:t>
+      </w:r>
+    </w:p>
+    <w:p>
+      <w:pPr>
+        <w:numPr>
+          <w:ilvl w:val="0"/>
+          <w:numId w:val="19"/>
+        </w:numPr>
+        <w:rPr>
+          <w:rFonts w:ascii="Arial" w:eastAsia="Times New Roman" w:hAnsi="Arial" w:cs="Arial"/>
+          <w:kern w:val="0"/>
+          <w:lang w:eastAsia="en-IE"/>
+          <w14:ligatures w14:val="none"/>
+        </w:rPr>
+      </w:pPr>
+      <w:r>
+        <w:rPr>
+          <w:rFonts w:ascii="Arial" w:eastAsia="Times New Roman" w:hAnsi="Arial" w:cs="Arial"/>
+          <w:b/>
+          <w:bCs/>
+          <w:kern w:val="0"/>
+          <w:lang w:eastAsia="en-IE"/>
+          <w14:ligatures w14:val="none"/>
+        </w:rPr>
+        <w:t>Threats:</w:t>
+      </w:r>
+      <w:r>
+        <w:rPr>
+          <w:rFonts w:ascii="Arial" w:eastAsia="Times New Roman" w:hAnsi="Arial" w:cs="Arial"/>
+          <w:kern w:val="0"/>
+          <w:lang w:eastAsia="en-IE"/>
+          <w14:ligatures w14:val="none"/>
+        </w:rPr>
+        <w:t xml:space="preserve"> Competitors with better stock management.</w:t>
+      </w:r>
+    </w:p>
+    <w:p>
+      <w:pPr>
+        <w:ind w:left="720"/>
+        <w:rPr>
+          <w:rFonts w:ascii="Arial" w:eastAsia="Times New Roman" w:hAnsi="Arial" w:cs="Arial"/>
+          <w:b/>
+          <w:bCs/>
+          <w:kern w:val="0"/>
+          <w:lang w:eastAsia="en-IE"/>
+          <w14:ligatures w14:val="none"/>
+        </w:rPr>
+      </w:pPr>
+    </w:p>
+    <w:p>
+      <w:pPr>
+        <w:ind w:left="720"/>
+        <w:rPr>
+          <w:rFonts w:ascii="Arial" w:eastAsia="Times New Roman" w:hAnsi="Arial" w:cs="Arial"/>
+          <w:kern w:val="0"/>
+          <w:lang w:eastAsia="en-IE"/>
+          <w14:ligatures w14:val="none"/>
+        </w:rPr>
+      </w:pPr>
+      <w:r>
+        <w:rPr>
+          <w:rFonts w:ascii="Arial" w:eastAsia="Times New Roman" w:hAnsi="Arial" w:cs="Arial"/>
+          <w:kern w:val="0"/>
+          <w:lang w:eastAsia="en-IE"/>
+          <w14:ligatures w14:val="none"/>
+        </w:rPr>
+        <w:t>Legal &amp; Ethical Considerations</w:t>
+      </w:r>
+    </w:p>
+    <w:p>
+      <w:pPr>
+        <w:ind w:left="720"/>
+        <w:rPr>
+          <w:rFonts w:ascii="Arial" w:eastAsia="Times New Roman" w:hAnsi="Arial" w:cs="Arial"/>
+          <w:kern w:val="0"/>
+          <w:lang w:eastAsia="en-IE"/>
+          <w14:ligatures w14:val="none"/>
+        </w:rPr>
+      </w:pPr>
+      <w:r>
+        <w:rPr>
+          <w:rFonts w:ascii="Arial" w:eastAsia="Times New Roman" w:hAnsi="Arial" w:cs="Arial"/>
+          <w:b/>
+          <w:bCs/>
+          <w:kern w:val="0"/>
+          <w:lang w:eastAsia="en-IE"/>
+          <w14:ligatures w14:val="none"/>
+        </w:rPr>
+        <w:lastRenderedPageBreak/>
+        <w:t>Key Considerations:</w:t>
+      </w:r>
+      <w:r>
+        <w:rPr>
+          <w:rFonts w:ascii="Arial" w:eastAsia="Times New Roman" w:hAnsi="Arial" w:cs="Arial"/>
+          <w:kern w:val="0"/>
+          <w:lang w:eastAsia="en-IE"/>
+          <w14:ligatures w14:val="none"/>
+        </w:rPr>
+        <w:br/>
+      </w:r>
+      <w:r>
+        <w:rPr>
+          <w:rFonts w:ascii="Arial" w:eastAsia="Times New Roman" w:hAnsi="Arial" w:cs="Arial"/>
+          <w:b/>
+          <w:bCs/>
+          <w:kern w:val="0"/>
+          <w:lang w:eastAsia="en-IE"/>
+          <w14:ligatures w14:val="none"/>
+        </w:rPr>
+        <w:t>No Personal Data Used</w:t>
+      </w:r>
+      <w:r>
+        <w:rPr>
+          <w:rFonts w:ascii="Arial" w:eastAsia="Times New Roman" w:hAnsi="Arial" w:cs="Arial"/>
+          <w:kern w:val="0"/>
+          <w:lang w:eastAsia="en-IE"/>
+          <w14:ligatures w14:val="none"/>
+        </w:rPr>
+        <w:t xml:space="preserve"> → Only product sales data is </w:t>
+      </w:r>
+      <w:r>
+        <w:rPr>
+          <w:rFonts w:ascii="Arial" w:eastAsia="Times New Roman" w:hAnsi="Arial" w:cs="Arial"/>
+          <w:kern w:val="0"/>
+          <w:lang w:eastAsia="en-IE"/>
+          <w14:ligatures w14:val="none"/>
+        </w:rPr>
+        <w:t>analysed</w:t>
+      </w:r>
+      <w:r>
+        <w:rPr>
+          <w:rFonts w:ascii="Arial" w:eastAsia="Times New Roman" w:hAnsi="Arial" w:cs="Arial"/>
+          <w:kern w:val="0"/>
+          <w:lang w:eastAsia="en-IE"/>
+          <w14:ligatures w14:val="none"/>
+        </w:rPr>
+        <w:t xml:space="preserve">, ensuring </w:t>
+      </w:r>
+      <w:r>
+        <w:rPr>
+          <w:rFonts w:ascii="Arial" w:eastAsia="Times New Roman" w:hAnsi="Arial" w:cs="Arial"/>
+          <w:b/>
+          <w:bCs/>
+          <w:kern w:val="0"/>
+          <w:lang w:eastAsia="en-IE"/>
+          <w14:ligatures w14:val="none"/>
+        </w:rPr>
+        <w:t>GDPR compliance</w:t>
+      </w:r>
+      <w:r>
+        <w:rPr>
+          <w:rFonts w:ascii="Arial" w:eastAsia="Times New Roman" w:hAnsi="Arial" w:cs="Arial"/>
+          <w:kern w:val="0"/>
+          <w:lang w:eastAsia="en-IE"/>
+          <w14:ligatures w14:val="none"/>
+        </w:rPr>
+        <w:t>.</w:t>
+      </w:r>
+      <w:r>
+        <w:rPr>
+          <w:rFonts w:ascii="Arial" w:eastAsia="Times New Roman" w:hAnsi="Arial" w:cs="Arial"/>
+          <w:kern w:val="0"/>
+          <w:lang w:eastAsia="en-IE"/>
+          <w14:ligatures w14:val="none"/>
+        </w:rPr>
+        <w:br/>
+      </w:r>
+      <w:r>
+        <w:rPr>
+          <w:rFonts w:ascii="Arial" w:eastAsia="Times New Roman" w:hAnsi="Arial" w:cs="Arial"/>
+          <w:b/>
+          <w:bCs/>
+          <w:kern w:val="0"/>
+          <w:lang w:eastAsia="en-IE"/>
+          <w14:ligatures w14:val="none"/>
+        </w:rPr>
+        <w:t>Ethical Data Use</w:t>
+      </w:r>
+      <w:r>
+        <w:rPr>
+          <w:rFonts w:ascii="Arial" w:eastAsia="Times New Roman" w:hAnsi="Arial" w:cs="Arial"/>
+          <w:kern w:val="0"/>
+          <w:lang w:eastAsia="en-IE"/>
+          <w14:ligatures w14:val="none"/>
+        </w:rPr>
+        <w:t xml:space="preserve"> → Insights focus on stock trends, not individual customer </w:t>
+      </w:r>
+      <w:r>
+        <w:rPr>
+          <w:rFonts w:ascii="Arial" w:eastAsia="Times New Roman" w:hAnsi="Arial" w:cs="Arial"/>
+          <w:kern w:val="0"/>
+          <w:lang w:eastAsia="en-IE"/>
+          <w14:ligatures w14:val="none"/>
+        </w:rPr>
+        <w:t>behaviours</w:t>
+      </w:r>
+      <w:r>
+        <w:rPr>
+          <w:rFonts w:ascii="Arial" w:eastAsia="Times New Roman" w:hAnsi="Arial" w:cs="Arial"/>
+          <w:kern w:val="0"/>
+          <w:lang w:eastAsia="en-IE"/>
+          <w14:ligatures w14:val="none"/>
+        </w:rPr>
+        <w:t>.</w:t>
+      </w:r>
+      <w:r>
+        <w:rPr>
+          <w:rFonts w:ascii="Arial" w:eastAsia="Times New Roman" w:hAnsi="Arial" w:cs="Arial"/>
+          <w:kern w:val="0"/>
+          <w:lang w:eastAsia="en-IE"/>
+          <w14:ligatures w14:val="none"/>
+        </w:rPr>
+        <w:br/>
+      </w:r>
+      <w:r>
+        <w:rPr>
+          <w:rFonts w:ascii="Arial" w:eastAsia="Times New Roman" w:hAnsi="Arial" w:cs="Arial"/>
+          <w:b/>
+          <w:bCs/>
+          <w:kern w:val="0"/>
+          <w:lang w:eastAsia="en-IE"/>
+          <w14:ligatures w14:val="none"/>
+        </w:rPr>
+        <w:t>Accuracy &amp; Transparency</w:t>
+      </w:r>
+      <w:r>
+        <w:rPr>
+          <w:rFonts w:ascii="Arial" w:eastAsia="Times New Roman" w:hAnsi="Arial" w:cs="Arial"/>
+          <w:kern w:val="0"/>
+          <w:lang w:eastAsia="en-IE"/>
+          <w14:ligatures w14:val="none"/>
+        </w:rPr>
+        <w:t xml:space="preserve"> → Data should be verified for accuracy before making business decisions.</w:t>
+      </w:r>
+    </w:p>
+    <w:p>
+      <w:pPr>
+        <w:rPr>
+          <w:rFonts w:ascii="Arial" w:eastAsia="Times New Roman" w:hAnsi="Arial" w:cs="Arial"/>
+          <w:b/>
+          <w:bCs/>
+          <w:kern w:val="0"/>
+          <w:lang w:eastAsia="en-IE"/>
+          <w14:ligatures w14:val="none"/>
+        </w:rPr>
+      </w:pPr>
+      <w:r>
+        <w:rPr>
+          <w:rFonts w:ascii="Arial" w:eastAsia="Times New Roman" w:hAnsi="Arial" w:cs="Arial"/>
+          <w:b/>
+          <w:bCs/>
+          <w:kern w:val="0"/>
+          <w:lang w:eastAsia="en-IE"/>
+          <w14:ligatures w14:val="none"/>
+        </w:rPr>
+        <w:t xml:space="preserve">Data Analytics </w:t>
+      </w:r>
+    </w:p>
+    <w:p>
+      <w:pPr>
+        <w:pStyle w:val="ListParagraph"/>
+        <w:numPr>
+          <w:ilvl w:val="0"/>
+          <w:numId w:val="21"/>
+        </w:numPr>
+        <w:rPr>
+          <w:rFonts w:ascii="Arial" w:eastAsia="Times New Roman" w:hAnsi="Arial" w:cs="Arial"/>
+          <w:kern w:val="0"/>
+          <w:lang w:eastAsia="en-IE"/>
+          <w14:ligatures w14:val="none"/>
+        </w:rPr>
+      </w:pPr>
+      <w:r>
+        <w:rPr>
+          <w:rFonts w:ascii="Arial" w:eastAsia="Times New Roman" w:hAnsi="Arial" w:cs="Arial"/>
+          <w:b/>
+          <w:bCs/>
+          <w:kern w:val="0"/>
+          <w:lang w:eastAsia="en-IE"/>
+          <w14:ligatures w14:val="none"/>
+        </w:rPr>
+        <w:t>Wine stock movement data</w:t>
+      </w:r>
+      <w:r>
+        <w:rPr>
+          <w:rFonts w:ascii="Arial" w:eastAsia="Times New Roman" w:hAnsi="Arial" w:cs="Arial"/>
+          <w:kern w:val="0"/>
+          <w:lang w:eastAsia="en-IE"/>
+          <w14:ligatures w14:val="none"/>
+        </w:rPr>
+        <w:t xml:space="preserve"> from RS Solutions.</w:t>
+      </w:r>
+    </w:p>
+    <w:p>
+      <w:pPr>
+        <w:numPr>
+          <w:ilvl w:val="0"/>
+          <w:numId w:val="20"/>
+        </w:numPr>
+        <w:rPr>
+          <w:rFonts w:ascii="Arial" w:eastAsia="Times New Roman" w:hAnsi="Arial" w:cs="Arial"/>
+          <w:kern w:val="0"/>
+          <w:lang w:eastAsia="en-IE"/>
+          <w14:ligatures w14:val="none"/>
+        </w:rPr>
+      </w:pPr>
+      <w:r>
+        <w:rPr>
+          <w:rFonts w:ascii="Arial" w:eastAsia="Times New Roman" w:hAnsi="Arial" w:cs="Arial"/>
+          <w:b/>
+          <w:bCs/>
+          <w:kern w:val="0"/>
+          <w:lang w:eastAsia="en-IE"/>
+          <w14:ligatures w14:val="none"/>
+        </w:rPr>
+        <w:t>Sales trends &amp; forecasting</w:t>
+      </w:r>
+      <w:r>
+        <w:rPr>
+          <w:rFonts w:ascii="Arial" w:eastAsia="Times New Roman" w:hAnsi="Arial" w:cs="Arial"/>
+          <w:kern w:val="0"/>
+          <w:lang w:eastAsia="en-IE"/>
+          <w14:ligatures w14:val="none"/>
+        </w:rPr>
+        <w:t xml:space="preserve"> to predict demand.</w:t>
+      </w:r>
+    </w:p>
+    <w:p>
+      <w:pPr>
+        <w:numPr>
+          <w:ilvl w:val="0"/>
+          <w:numId w:val="20"/>
+        </w:numPr>
+        <w:rPr>
+          <w:rFonts w:ascii="Arial" w:eastAsia="Times New Roman" w:hAnsi="Arial" w:cs="Arial"/>
+          <w:kern w:val="0"/>
+          <w:lang w:eastAsia="en-IE"/>
+          <w14:ligatures w14:val="none"/>
+        </w:rPr>
+      </w:pPr>
+      <w:r>
+        <w:rPr>
+          <w:rFonts w:ascii="Arial" w:eastAsia="Times New Roman" w:hAnsi="Arial" w:cs="Arial"/>
+          <w:b/>
+          <w:bCs/>
+          <w:kern w:val="0"/>
+          <w:lang w:eastAsia="en-IE"/>
+          <w14:ligatures w14:val="none"/>
+        </w:rPr>
+        <w:t>Stock shortage patterns</w:t>
+      </w:r>
+      <w:r>
+        <w:rPr>
+          <w:rFonts w:ascii="Arial" w:eastAsia="Times New Roman" w:hAnsi="Arial" w:cs="Arial"/>
+          <w:kern w:val="0"/>
+          <w:lang w:eastAsia="en-IE"/>
+          <w14:ligatures w14:val="none"/>
+        </w:rPr>
+        <w:t xml:space="preserve"> to prevent lost sales.</w:t>
+      </w:r>
+    </w:p>
+    <w:p>
+      <w:pPr>
+        <w:rPr>
+          <w:rFonts w:ascii="Arial" w:eastAsia="Times New Roman" w:hAnsi="Arial" w:cs="Arial"/>
+          <w:kern w:val="0"/>
+          <w:lang w:eastAsia="en-IE"/>
+          <w14:ligatures w14:val="none"/>
+        </w:rPr>
+      </w:pPr>
+    </w:p>
+    <w:p>
+      <w:pPr>
+        <w:rPr>
+          <w:rFonts w:ascii="Arial" w:eastAsia="Times New Roman" w:hAnsi="Arial" w:cs="Arial"/>
+          <w:kern w:val="0"/>
+          <w:lang w:eastAsia="en-IE"/>
+          <w14:ligatures w14:val="none"/>
+        </w:rPr>
+      </w:pPr>
+    </w:p>
+    <w:p>
+      <w:pPr>
+        <w:rPr>
+          <w:rFonts w:ascii="Arial" w:eastAsia="Times New Roman" w:hAnsi="Arial" w:cs="Arial"/>
+          <w:kern w:val="0"/>
+          <w:lang w:eastAsia="en-IE"/>
+          <w14:ligatures w14:val="none"/>
+        </w:rPr>
+      </w:pPr>
+      <w:r>
+        <w:rPr>
+          <w:rFonts w:ascii="Arial" w:eastAsia="Times New Roman" w:hAnsi="Arial" w:cs="Arial"/>
+          <w:b/>
+          <w:bCs/>
+          <w:kern w:val="0"/>
+          <w:lang w:eastAsia="en-IE"/>
+          <w14:ligatures w14:val="none"/>
+        </w:rPr>
+        <w:t>Stock Analysis</w:t>
+      </w:r>
+      <w:r>
+        <w:rPr>
+          <w:rFonts w:ascii="Arial" w:eastAsia="Times New Roman" w:hAnsi="Arial" w:cs="Arial"/>
+          <w:kern w:val="0"/>
+          <w:lang w:eastAsia="en-IE"/>
+          <w14:ligatures w14:val="none"/>
+        </w:rPr>
+        <w:t xml:space="preserve"> section:</w:t>
+      </w:r>
+    </w:p>
+    <w:p>
+      <w:pPr>
+        <w:numPr>
+          <w:ilvl w:val="0"/>
+          <w:numId w:val="17"/>
+        </w:numPr>
+        <w:rPr>
+          <w:rFonts w:ascii="Arial" w:eastAsia="Times New Roman" w:hAnsi="Arial" w:cs="Arial"/>
+          <w:kern w:val="0"/>
+          <w:lang w:eastAsia="en-IE"/>
+          <w14:ligatures w14:val="none"/>
+        </w:rPr>
+      </w:pPr>
+      <w:r>
+        <w:rPr>
+          <w:rFonts w:ascii="Arial" w:eastAsia="Times New Roman" w:hAnsi="Arial" w:cs="Arial"/>
+          <w:b/>
+          <w:bCs/>
+          <w:kern w:val="0"/>
+          <w:lang w:eastAsia="en-IE"/>
+          <w14:ligatures w14:val="none"/>
+        </w:rPr>
+        <w:t>Stock Received</w:t>
+      </w:r>
+      <w:r>
+        <w:rPr>
+          <w:rFonts w:ascii="Arial" w:eastAsia="Times New Roman" w:hAnsi="Arial" w:cs="Arial"/>
+          <w:kern w:val="0"/>
+          <w:lang w:eastAsia="en-IE"/>
+          <w14:ligatures w14:val="none"/>
+        </w:rPr>
+        <w:t xml:space="preserve"> → How much of each wine was delivered?</w:t>
+      </w:r>
+    </w:p>
+    <w:p>
+      <w:pPr>
+        <w:numPr>
+          <w:ilvl w:val="0"/>
+          <w:numId w:val="17"/>
+        </w:numPr>
+        <w:rPr>
+          <w:rFonts w:ascii="Arial" w:eastAsia="Times New Roman" w:hAnsi="Arial" w:cs="Arial"/>
+          <w:kern w:val="0"/>
+          <w:lang w:eastAsia="en-IE"/>
+          <w14:ligatures w14:val="none"/>
+        </w:rPr>
+      </w:pPr>
+      <w:r>
+        <w:rPr>
+          <w:rFonts w:ascii="Arial" w:eastAsia="Times New Roman" w:hAnsi="Arial" w:cs="Arial"/>
+          <w:b/>
+          <w:bCs/>
+          <w:kern w:val="0"/>
+          <w:lang w:eastAsia="en-IE"/>
+          <w14:ligatures w14:val="none"/>
+        </w:rPr>
+        <w:t>Stock Sold</w:t>
+      </w:r>
+      <w:r>
+        <w:rPr>
+          <w:rFonts w:ascii="Arial" w:eastAsia="Times New Roman" w:hAnsi="Arial" w:cs="Arial"/>
+          <w:kern w:val="0"/>
+          <w:lang w:eastAsia="en-IE"/>
+          <w14:ligatures w14:val="none"/>
+        </w:rPr>
+        <w:t xml:space="preserve"> → How much of each wine was sold?</w:t>
+      </w:r>
+    </w:p>
+    <w:p>
+      <w:pPr>
+        <w:numPr>
+          <w:ilvl w:val="0"/>
+          <w:numId w:val="17"/>
+        </w:numPr>
+        <w:rPr>
+          <w:rFonts w:ascii="Arial" w:eastAsia="Times New Roman" w:hAnsi="Arial" w:cs="Arial"/>
+          <w:kern w:val="0"/>
+          <w:lang w:eastAsia="en-IE"/>
+          <w14:ligatures w14:val="none"/>
+        </w:rPr>
+      </w:pPr>
+      <w:r>
+        <w:rPr>
+          <w:rFonts w:ascii="Arial" w:eastAsia="Times New Roman" w:hAnsi="Arial" w:cs="Arial"/>
+          <w:b/>
+          <w:bCs/>
+          <w:kern w:val="0"/>
+          <w:lang w:eastAsia="en-IE"/>
+          <w14:ligatures w14:val="none"/>
+        </w:rPr>
+        <w:t>Stock Remaining</w:t>
+      </w:r>
+      <w:r>
+        <w:rPr>
+          <w:rFonts w:ascii="Arial" w:eastAsia="Times New Roman" w:hAnsi="Arial" w:cs="Arial"/>
+          <w:kern w:val="0"/>
+          <w:lang w:eastAsia="en-IE"/>
+          <w14:ligatures w14:val="none"/>
+        </w:rPr>
+        <w:t xml:space="preserve"> → How much is left in stock?</w:t>
+      </w:r>
+    </w:p>
+    <w:p>
+      <w:pPr>
+        <w:numPr>
+          <w:ilvl w:val="0"/>
+          <w:numId w:val="17"/>
+        </w:numPr>
+        <w:rPr>
+          <w:rFonts w:ascii="Arial" w:eastAsia="Times New Roman" w:hAnsi="Arial" w:cs="Arial"/>
+          <w:kern w:val="0"/>
+          <w:lang w:eastAsia="en-IE"/>
+          <w14:ligatures w14:val="none"/>
+        </w:rPr>
+      </w:pPr>
+      <w:r>
+        <w:rPr>
+          <w:rFonts w:ascii="Arial" w:eastAsia="Times New Roman" w:hAnsi="Arial" w:cs="Arial"/>
+          <w:b/>
+          <w:bCs/>
+          <w:kern w:val="0"/>
+          <w:lang w:eastAsia="en-IE"/>
+          <w14:ligatures w14:val="none"/>
+        </w:rPr>
+        <w:t>Stock Turnover Rate</w:t>
+      </w:r>
+      <w:r>
+        <w:rPr>
+          <w:rFonts w:ascii="Arial" w:eastAsia="Times New Roman" w:hAnsi="Arial" w:cs="Arial"/>
+          <w:kern w:val="0"/>
+          <w:lang w:eastAsia="en-IE"/>
+          <w14:ligatures w14:val="none"/>
+        </w:rPr>
+        <w:t xml:space="preserve"> → How quickly stock is sold and replenished.</w:t>
+      </w:r>
+    </w:p>
+    <w:p>
+      <w:pPr>
+        <w:numPr>
+          <w:ilvl w:val="0"/>
+          <w:numId w:val="17"/>
+        </w:numPr>
+        <w:rPr>
+          <w:rFonts w:ascii="Arial" w:eastAsia="Times New Roman" w:hAnsi="Arial" w:cs="Arial"/>
+          <w:kern w:val="0"/>
+          <w:lang w:eastAsia="en-IE"/>
+          <w14:ligatures w14:val="none"/>
+        </w:rPr>
+      </w:pPr>
+      <w:r>
+        <w:rPr>
+          <w:rFonts w:ascii="Arial" w:eastAsia="Times New Roman" w:hAnsi="Arial" w:cs="Arial"/>
+          <w:b/>
+          <w:bCs/>
+          <w:kern w:val="0"/>
+          <w:lang w:eastAsia="en-IE"/>
+          <w14:ligatures w14:val="none"/>
+        </w:rPr>
+        <w:t>Dates of Stock Movement</w:t>
+      </w:r>
+      <w:r>
+        <w:rPr>
+          <w:rFonts w:ascii="Arial" w:eastAsia="Times New Roman" w:hAnsi="Arial" w:cs="Arial"/>
+          <w:kern w:val="0"/>
+          <w:lang w:eastAsia="en-IE"/>
+          <w14:ligatures w14:val="none"/>
+        </w:rPr>
+        <w:t xml:space="preserve"> → Helps track when sales peak and when shortages occur.</w:t>
+      </w:r>
+    </w:p>
+    <w:p>
+      <w:pPr>
+        <w:rPr>
+          <w:rFonts w:ascii="Arial" w:eastAsia="Times New Roman" w:hAnsi="Arial" w:cs="Arial"/>
+          <w:b/>
+          <w:bCs/>
+          <w:kern w:val="0"/>
+          <w:sz w:val="24"/>
+          <w:szCs w:val="24"/>
+          <w:lang w:eastAsia="en-IE"/>
+          <w14:ligatures w14:val="none"/>
+        </w:rPr>
+      </w:pPr>
+      <w:r>
+        <w:rPr>
+          <w:rFonts w:ascii="Arial" w:eastAsia="Times New Roman" w:hAnsi="Arial" w:cs="Arial"/>
+          <w:b/>
+          <w:bCs/>
+          <w:kern w:val="0"/>
+          <w:sz w:val="24"/>
+          <w:szCs w:val="24"/>
+          <w:lang w:eastAsia="en-IE"/>
+          <w14:ligatures w14:val="none"/>
+        </w:rPr>
+        <w:t>Competitive Advantage for Lotts &amp; Co.</w:t>
+      </w:r>
+    </w:p>
+    <w:p>
+      <w:pPr>
+        <w:rPr>
+          <w:rFonts w:ascii="Arial" w:eastAsia="Times New Roman" w:hAnsi="Arial" w:cs="Arial"/>
+          <w:b/>
+          <w:bCs/>
+          <w:kern w:val="0"/>
+          <w:sz w:val="24"/>
+          <w:szCs w:val="24"/>
+          <w:lang w:eastAsia="en-IE"/>
+          <w14:ligatures w14:val="none"/>
+        </w:rPr>
+      </w:pPr>
+    </w:p>
+    <w:p>
+      <w:pPr>
+        <w:pStyle w:val="ListParagraph"/>
+        <w:numPr>
+          <w:ilvl w:val="0"/>
+          <w:numId w:val="21"/>
+        </w:numPr>
+        <w:rPr>
+          <w:rFonts w:ascii="Arial" w:eastAsia="Times New Roman" w:hAnsi="Arial" w:cs="Arial"/>
+          <w:b/>
+          <w:bCs/>
+          <w:kern w:val="0"/>
+          <w:sz w:val="24"/>
+          <w:szCs w:val="24"/>
+          <w:lang w:eastAsia="en-IE"/>
+          <w14:ligatures w14:val="none"/>
+        </w:rPr>
+      </w:pPr>
+      <w:r>
+        <w:rPr>
+          <w:rFonts w:ascii="Arial" w:eastAsia="Times New Roman" w:hAnsi="Arial" w:cs="Arial"/>
+          <w:b/>
+          <w:bCs/>
+          <w:kern w:val="0"/>
+          <w:sz w:val="24"/>
+          <w:szCs w:val="24"/>
+          <w:lang w:eastAsia="en-IE"/>
+          <w14:ligatures w14:val="none"/>
+        </w:rPr>
+        <w:t xml:space="preserve">Reduces Stockouts → </w:t>
+      </w:r>
+      <w:r>
+        <w:rPr>
+          <w:rFonts w:ascii="Arial" w:eastAsia="Times New Roman" w:hAnsi="Arial" w:cs="Arial"/>
+          <w:kern w:val="0"/>
+          <w:sz w:val="24"/>
+          <w:szCs w:val="24"/>
+          <w:lang w:eastAsia="en-IE"/>
+          <w14:ligatures w14:val="none"/>
+        </w:rPr>
+        <w:t>Ensures best-selling wines are always available</w:t>
+      </w:r>
+    </w:p>
+    <w:p>
+      <w:pPr>
+        <w:pStyle w:val="ListParagraph"/>
+        <w:numPr>
+          <w:ilvl w:val="0"/>
+          <w:numId w:val="21"/>
         </w:numPr>
         <w:spacing w:before="100" w:beforeAutospacing="1" w:after="100" w:afterAutospacing="1" w:line="240" w:lineRule="auto"/>
         <w:rPr>
+          <w:rFonts w:ascii="Arial" w:eastAsia="Times New Roman" w:hAnsi="Arial" w:cs="Arial"/>
           <w:b/>
           <w:bCs/>
-        </w:rPr>
-      </w:pPr>
-      <w:r>
-        <w:t>SWOT Analysis</w:t>
-      </w:r>
-      <w:r>
-        <w:t xml:space="preserve"> (</w:t>
-      </w:r>
-      <w:r>
-        <w:rPr>
+          <w:i/>
+          <w:iCs/>
+          <w:kern w:val="0"/>
+          <w:lang w:eastAsia="en-IE"/>
+          <w14:ligatures w14:val="none"/>
+        </w:rPr>
+      </w:pPr>
+      <w:r>
+        <w:rPr>
+          <w:rFonts w:ascii="Arial" w:eastAsia="Times New Roman" w:hAnsi="Arial" w:cs="Arial"/>
           <w:b/>
           <w:bCs/>
-        </w:rPr>
-        <w:t>Strengths</w:t>
-      </w:r>
-      <w:r>
-        <w:t>,</w:t>
-      </w:r>
-      <w:r>
-        <w:t xml:space="preserve"> Weaknesses</w:t>
-      </w:r>
-      <w:r>
-        <w:rPr>
+          <w:i/>
+          <w:iCs/>
+          <w:kern w:val="0"/>
+          <w:lang w:eastAsia="en-IE"/>
+          <w14:ligatures w14:val="none"/>
+        </w:rPr>
+        <w:t xml:space="preserve">Data-Driven Ordering → </w:t>
+      </w:r>
+      <w:r>
+        <w:rPr>
+          <w:rFonts w:ascii="Arial" w:eastAsia="Times New Roman" w:hAnsi="Arial" w:cs="Arial"/>
+          <w:i/>
+          <w:iCs/>
+          <w:kern w:val="0"/>
+          <w:lang w:eastAsia="en-IE"/>
+          <w14:ligatures w14:val="none"/>
+        </w:rPr>
+        <w:t>Avoids overstocking &amp; ties up less capital.</w:t>
+      </w:r>
+    </w:p>
+    <w:p>
+      <w:pPr>
+        <w:pStyle w:val="ListParagraph"/>
+        <w:numPr>
+          <w:ilvl w:val="0"/>
+          <w:numId w:val="21"/>
+        </w:numPr>
+        <w:spacing w:before="100" w:beforeAutospacing="1" w:after="100" w:afterAutospacing="1" w:line="240" w:lineRule="auto"/>
+        <w:rPr>
+          <w:rFonts w:ascii="Arial" w:eastAsia="Times New Roman" w:hAnsi="Arial" w:cs="Arial"/>
+          <w:i/>
+          <w:iCs/>
+          <w:kern w:val="0"/>
+          <w:lang w:eastAsia="en-IE"/>
+          <w14:ligatures w14:val="none"/>
+        </w:rPr>
+      </w:pPr>
+      <w:r>
+        <w:rPr>
+          <w:rFonts w:ascii="Arial" w:eastAsia="Times New Roman" w:hAnsi="Arial" w:cs="Arial"/>
           <w:b/>
           <w:bCs/>
-        </w:rPr>
-        <w:t>,</w:t>
-      </w:r>
-      <w:r>
-        <w:t xml:space="preserve"> </w:t>
-      </w:r>
-      <w:r>
-        <w:rPr>
+          <w:i/>
+          <w:iCs/>
+          <w:kern w:val="0"/>
+          <w:lang w:eastAsia="en-IE"/>
+          <w14:ligatures w14:val="none"/>
+        </w:rPr>
+        <w:t>Improved Supplier Coordination</w:t>
+      </w:r>
+      <w:r>
+        <w:rPr>
+          <w:rFonts w:ascii="Arial" w:eastAsia="Times New Roman" w:hAnsi="Arial" w:cs="Arial"/>
+          <w:i/>
+          <w:iCs/>
+          <w:kern w:val="0"/>
+          <w:lang w:eastAsia="en-IE"/>
+          <w14:ligatures w14:val="none"/>
+        </w:rPr>
+        <w:t xml:space="preserve"> → Orders based on real sales data, not guesswork.</w:t>
+      </w:r>
+    </w:p>
+    <w:p>
+      <w:pPr>
+        <w:pStyle w:val="ListParagraph"/>
+        <w:numPr>
+          <w:ilvl w:val="0"/>
+          <w:numId w:val="21"/>
+        </w:numPr>
+        <w:spacing w:before="100" w:beforeAutospacing="1" w:after="100" w:afterAutospacing="1" w:line="240" w:lineRule="auto"/>
+        <w:rPr>
+          <w:rFonts w:ascii="Arial" w:eastAsia="Times New Roman" w:hAnsi="Arial" w:cs="Arial"/>
+          <w:i/>
+          <w:iCs/>
+          <w:kern w:val="0"/>
+          <w:lang w:eastAsia="en-IE"/>
+          <w14:ligatures w14:val="none"/>
+        </w:rPr>
+      </w:pPr>
+      <w:r>
+        <w:rPr>
+          <w:rFonts w:ascii="Arial" w:eastAsia="Times New Roman" w:hAnsi="Arial" w:cs="Arial"/>
           <w:b/>
           <w:bCs/>
-        </w:rPr>
-        <w:t>Opportunities, Threats</w:t>
-      </w:r>
-      <w:r>
-        <w:rPr>
-          <w:b/>
-          <w:bCs/>
-        </w:rPr>
-        <w:t>)</w:t>
+          <w:i/>
+          <w:iCs/>
+          <w:kern w:val="0"/>
+          <w:lang w:eastAsia="en-IE"/>
+          <w14:ligatures w14:val="none"/>
+        </w:rPr>
+        <w:t>Supports Future Growth</w:t>
+      </w:r>
+      <w:r>
+        <w:rPr>
+          <w:rFonts w:ascii="Arial" w:eastAsia="Times New Roman" w:hAnsi="Arial" w:cs="Arial"/>
+          <w:i/>
+          <w:iCs/>
+          <w:kern w:val="0"/>
+          <w:lang w:eastAsia="en-IE"/>
+          <w14:ligatures w14:val="none"/>
+        </w:rPr>
+        <w:t xml:space="preserve"> → Can scale with other product categories (cheese, deli, bread)</w:t>
       </w:r>
     </w:p>
     <w:p>
       <w:pPr>
         <w:spacing w:before="100" w:beforeAutospacing="1" w:after="100" w:afterAutospacing="1" w:line="240" w:lineRule="auto"/>
-      </w:pPr>
-      <w:r>
-        <w:t>DATA COLLECTION AND ANALYSIS</w:t>
-      </w:r>
+        <w:rPr>
+          <w:rFonts w:ascii="Arial" w:eastAsia="Times New Roman" w:hAnsi="Arial" w:cs="Arial"/>
+          <w:i/>
+          <w:iCs/>
+          <w:kern w:val="0"/>
+          <w:lang w:eastAsia="en-IE"/>
+          <w14:ligatures w14:val="none"/>
+        </w:rPr>
+      </w:pPr>
+    </w:p>
+    <w:p>
+      <w:pPr>
+        <w:spacing w:before="100" w:beforeAutospacing="1" w:after="100" w:afterAutospacing="1" w:line="240" w:lineRule="auto"/>
+      </w:pPr>
     </w:p>
     <w:p>
       <w:pPr>
@@ -585,6 +1812,155 @@
 <file path=word/numbering.xml><?xml version="1.0" encoding="utf-8"?>
 <w:numbering xmlns:wpc="http://schemas.microsoft.com/office/word/2010/wordprocessingCanvas" xmlns:cx="http://schemas.microsoft.com/office/drawing/2014/chartex" xmlns:cx1="http://schemas.microsoft.com/office/drawing/2015/9/8/chartex" xmlns:cx2="http://schemas.microsoft.com/office/drawing/2015/10/21/chartex" xmlns:cx3="http://schemas.microsoft.com/office/drawing/2016/5/9/chartex" xmlns:cx4="http://schemas.microsoft.com/office/drawing/2016/5/10/chartex" xmlns:cx5="http://schemas.microsoft.com/office/drawing/2016/5/11/chartex" xmlns:cx6="http://schemas.microsoft.com/office/drawing/2016/5/12/chartex" xmlns:cx7="http://schemas.microsoft.com/office/drawing/2016/5/13/chartex" xmlns:cx8="http://schemas.microsoft.com/office/drawing/2016/5/14/chartex" xmlns:mc="http://schemas.openxmlformats.org/markup-compatibility/2006" xmlns:aink="http://schemas.microsoft.com/office/drawing/2016/ink" xmlns:am3d="http://schemas.microsoft.com/office/drawing/2017/model3d" xmlns:o="urn:schemas-microsoft-com:office:office" xmlns:oel="http://schemas.microsoft.com/office/2019/extlst" xmlns:r="http://schemas.openxmlformats.org/officeDocument/2006/relationships" xmlns:m="http://schemas.openxmlformats.org/officeDocument/2006/math" xmlns:v="urn:schemas-microsoft-com:vml" xmlns:wp14="http://schemas.microsoft.com/office/word/2010/wordprocessingDrawing" xmlns:wp="http://schemas.openxmlformats.org/drawingml/2006/wordprocessingDrawing" xmlns:w10="urn:schemas-microsoft-com:office:word" xmlns:w="http://schemas.openxmlformats.org/wordprocessingml/2006/main" xmlns:w14="http://schemas.microsoft.com/office/word/2010/wordml" xmlns:w15="http://schemas.microsoft.com/office/word/2012/wordml" xmlns:w16cex="http://schemas.microsoft.com/office/word/2018/wordml/cex" xmlns:w16cid="http://schemas.microsoft.com/office/word/2016/wordml/cid" xmlns:w16="http://schemas.microsoft.com/office/word/2018/wordml" xmlns:w16du="http://schemas.microsoft.com/office/word/2023/wordml/word16du" xmlns:w16sdtdh="http://schemas.microsoft.com/office/word/2020/wordml/sdtdatahash" xmlns:w16sdtfl="http://schemas.microsoft.com/office/word/2024/wordml/sdtformatlock" xmlns:w16se="http://schemas.microsoft.com/office/word/2015/wordml/symex" xmlns:wpg="http://schemas.microsoft.com/office/word/2010/wordprocessingGroup" xmlns:wpi="http://schemas.microsoft.com/office/word/2010/wordprocessingInk" xmlns:wne="http://schemas.microsoft.com/office/word/2006/wordml" xmlns:wps="http://schemas.microsoft.com/office/word/2010/wordprocessingShape" mc:Ignorable="w14 w15 w16se w16cid w16 w16cex w16sdtdh w16sdtfl w16du wp14">
   <w:abstractNum w:abstractNumId="0" w15:restartNumberingAfterBreak="0">
+    <w:nsid w:val="001D0617"/>
+    <w:multiLevelType w:val="multilevel"/>
+    <w:tmpl w:val="9432D168"/>
+    <w:lvl w:ilvl="0">
+      <w:start w:val="1"/>
+      <w:numFmt w:val="bullet"/>
+      <w:lvlText w:val=""/>
+      <w:lvlJc w:val="left"/>
+      <w:pPr>
+        <w:tabs>
+          <w:tab w:val="num" w:pos="720"/>
+        </w:tabs>
+        <w:ind w:left="720" w:hanging="360"/>
+      </w:pPr>
+      <w:rPr>
+        <w:rFonts w:ascii="Symbol" w:hAnsi="Symbol" w:hint="default"/>
+        <w:sz w:val="20"/>
+      </w:rPr>
+    </w:lvl>
+    <w:lvl w:ilvl="1" w:tentative="1">
+      <w:start w:val="1"/>
+      <w:numFmt w:val="bullet"/>
+      <w:lvlText w:val="o"/>
+      <w:lvlJc w:val="left"/>
+      <w:pPr>
+        <w:tabs>
+          <w:tab w:val="num" w:pos="1440"/>
+        </w:tabs>
+        <w:ind w:left="1440" w:hanging="360"/>
+      </w:pPr>
+      <w:rPr>
+        <w:rFonts w:ascii="Courier New" w:hAnsi="Courier New" w:hint="default"/>
+        <w:sz w:val="20"/>
+      </w:rPr>
+    </w:lvl>
+    <w:lvl w:ilvl="2" w:tentative="1">
+      <w:start w:val="1"/>
+      <w:numFmt w:val="bullet"/>
+      <w:lvlText w:val=""/>
+      <w:lvlJc w:val="left"/>
+      <w:pPr>
+        <w:tabs>
+          <w:tab w:val="num" w:pos="2160"/>
+        </w:tabs>
+        <w:ind w:left="2160" w:hanging="360"/>
+      </w:pPr>
+      <w:rPr>
+        <w:rFonts w:ascii="Wingdings" w:hAnsi="Wingdings" w:hint="default"/>
+        <w:sz w:val="20"/>
+      </w:rPr>
+    </w:lvl>
+    <w:lvl w:ilvl="3" w:tentative="1">
+      <w:start w:val="1"/>
+      <w:numFmt w:val="bullet"/>
+      <w:lvlText w:val=""/>
+      <w:lvlJc w:val="left"/>
+      <w:pPr>
+        <w:tabs>
+          <w:tab w:val="num" w:pos="2880"/>
+        </w:tabs>
+        <w:ind w:left="2880" w:hanging="360"/>
+      </w:pPr>
+      <w:rPr>
+        <w:rFonts w:ascii="Wingdings" w:hAnsi="Wingdings" w:hint="default"/>
+        <w:sz w:val="20"/>
+      </w:rPr>
+    </w:lvl>
+    <w:lvl w:ilvl="4" w:tentative="1">
+      <w:start w:val="1"/>
+      <w:numFmt w:val="bullet"/>
+      <w:lvlText w:val=""/>
+      <w:lvlJc w:val="left"/>
+      <w:pPr>
+        <w:tabs>
+          <w:tab w:val="num" w:pos="3600"/>
+        </w:tabs>
+        <w:ind w:left="3600" w:hanging="360"/>
+      </w:pPr>
+      <w:rPr>
+        <w:rFonts w:ascii="Wingdings" w:hAnsi="Wingdings" w:hint="default"/>
+        <w:sz w:val="20"/>
+      </w:rPr>
+    </w:lvl>
+    <w:lvl w:ilvl="5" w:tentative="1">
+      <w:start w:val="1"/>
+      <w:numFmt w:val="bullet"/>
+      <w:lvlText w:val=""/>
+      <w:lvlJc w:val="left"/>
+      <w:pPr>
+        <w:tabs>
+          <w:tab w:val="num" w:pos="4320"/>
+        </w:tabs>
+        <w:ind w:left="4320" w:hanging="360"/>
+      </w:pPr>
+      <w:rPr>
+        <w:rFonts w:ascii="Wingdings" w:hAnsi="Wingdings" w:hint="default"/>
+        <w:sz w:val="20"/>
+      </w:rPr>
+    </w:lvl>
+    <w:lvl w:ilvl="6" w:tentative="1">
+      <w:start w:val="1"/>
+      <w:numFmt w:val="bullet"/>
+      <w:lvlText w:val=""/>
+      <w:lvlJc w:val="left"/>
+      <w:pPr>
+        <w:tabs>
+          <w:tab w:val="num" w:pos="5040"/>
+        </w:tabs>
+        <w:ind w:left="5040" w:hanging="360"/>
+      </w:pPr>
+      <w:rPr>
+        <w:rFonts w:ascii="Wingdings" w:hAnsi="Wingdings" w:hint="default"/>
+        <w:sz w:val="20"/>
+      </w:rPr>
+    </w:lvl>
+    <w:lvl w:ilvl="7" w:tentative="1">
+      <w:start w:val="1"/>
+      <w:numFmt w:val="bullet"/>
+      <w:lvlText w:val=""/>
+      <w:lvlJc w:val="left"/>
+      <w:pPr>
+        <w:tabs>
+          <w:tab w:val="num" w:pos="5760"/>
+        </w:tabs>
+        <w:ind w:left="5760" w:hanging="360"/>
+      </w:pPr>
+      <w:rPr>
+        <w:rFonts w:ascii="Wingdings" w:hAnsi="Wingdings" w:hint="default"/>
+        <w:sz w:val="20"/>
+      </w:rPr>
+    </w:lvl>
+    <w:lvl w:ilvl="8" w:tentative="1">
+      <w:start w:val="1"/>
+      <w:numFmt w:val="bullet"/>
+      <w:lvlText w:val=""/>
+      <w:lvlJc w:val="left"/>
+      <w:pPr>
+        <w:tabs>
+          <w:tab w:val="num" w:pos="6480"/>
+        </w:tabs>
+        <w:ind w:left="6480" w:hanging="360"/>
+      </w:pPr>
+      <w:rPr>
+        <w:rFonts w:ascii="Wingdings" w:hAnsi="Wingdings" w:hint="default"/>
+        <w:sz w:val="20"/>
+      </w:rPr>
+    </w:lvl>
+  </w:abstractNum>
+  <w:abstractNum w:abstractNumId="1" w15:restartNumberingAfterBreak="0">
     <w:nsid w:val="04C704EB"/>
     <w:multiLevelType w:val="hybridMultilevel"/>
     <w:tmpl w:val="D1A66730"/>
@@ -697,7 +2073,7 @@
       </w:rPr>
     </w:lvl>
   </w:abstractNum>
-  <w:abstractNum w:abstractNumId="1" w15:restartNumberingAfterBreak="0">
+  <w:abstractNum w:abstractNumId="2" w15:restartNumberingAfterBreak="0">
     <w:nsid w:val="06407D9F"/>
     <w:multiLevelType w:val="hybridMultilevel"/>
     <w:tmpl w:val="10C269AC"/>
@@ -810,7 +2186,156 @@
       </w:rPr>
     </w:lvl>
   </w:abstractNum>
-  <w:abstractNum w:abstractNumId="2" w15:restartNumberingAfterBreak="0">
+  <w:abstractNum w:abstractNumId="3" w15:restartNumberingAfterBreak="0">
+    <w:nsid w:val="06970194"/>
+    <w:multiLevelType w:val="multilevel"/>
+    <w:tmpl w:val="95B8600E"/>
+    <w:lvl w:ilvl="0">
+      <w:start w:val="1"/>
+      <w:numFmt w:val="bullet"/>
+      <w:lvlText w:val=""/>
+      <w:lvlJc w:val="left"/>
+      <w:pPr>
+        <w:tabs>
+          <w:tab w:val="num" w:pos="720"/>
+        </w:tabs>
+        <w:ind w:left="720" w:hanging="360"/>
+      </w:pPr>
+      <w:rPr>
+        <w:rFonts w:ascii="Symbol" w:hAnsi="Symbol" w:hint="default"/>
+        <w:sz w:val="20"/>
+      </w:rPr>
+    </w:lvl>
+    <w:lvl w:ilvl="1" w:tentative="1">
+      <w:start w:val="1"/>
+      <w:numFmt w:val="bullet"/>
+      <w:lvlText w:val="o"/>
+      <w:lvlJc w:val="left"/>
+      <w:pPr>
+        <w:tabs>
+          <w:tab w:val="num" w:pos="1440"/>
+        </w:tabs>
+        <w:ind w:left="1440" w:hanging="360"/>
+      </w:pPr>
+      <w:rPr>
+        <w:rFonts w:ascii="Courier New" w:hAnsi="Courier New" w:hint="default"/>
+        <w:sz w:val="20"/>
+      </w:rPr>
+    </w:lvl>
+    <w:lvl w:ilvl="2" w:tentative="1">
+      <w:start w:val="1"/>
+      <w:numFmt w:val="bullet"/>
+      <w:lvlText w:val=""/>
+      <w:lvlJc w:val="left"/>
+      <w:pPr>
+        <w:tabs>
+          <w:tab w:val="num" w:pos="2160"/>
+        </w:tabs>
+        <w:ind w:left="2160" w:hanging="360"/>
+      </w:pPr>
+      <w:rPr>
+        <w:rFonts w:ascii="Wingdings" w:hAnsi="Wingdings" w:hint="default"/>
+        <w:sz w:val="20"/>
+      </w:rPr>
+    </w:lvl>
+    <w:lvl w:ilvl="3" w:tentative="1">
+      <w:start w:val="1"/>
+      <w:numFmt w:val="bullet"/>
+      <w:lvlText w:val=""/>
+      <w:lvlJc w:val="left"/>
+      <w:pPr>
+        <w:tabs>
+          <w:tab w:val="num" w:pos="2880"/>
+        </w:tabs>
+        <w:ind w:left="2880" w:hanging="360"/>
+      </w:pPr>
+      <w:rPr>
+        <w:rFonts w:ascii="Wingdings" w:hAnsi="Wingdings" w:hint="default"/>
+        <w:sz w:val="20"/>
+      </w:rPr>
+    </w:lvl>
+    <w:lvl w:ilvl="4" w:tentative="1">
+      <w:start w:val="1"/>
+      <w:numFmt w:val="bullet"/>
+      <w:lvlText w:val=""/>
+      <w:lvlJc w:val="left"/>
+      <w:pPr>
+        <w:tabs>
+          <w:tab w:val="num" w:pos="3600"/>
+        </w:tabs>
+        <w:ind w:left="3600" w:hanging="360"/>
+      </w:pPr>
+      <w:rPr>
+        <w:rFonts w:ascii="Wingdings" w:hAnsi="Wingdings" w:hint="default"/>
+        <w:sz w:val="20"/>
+      </w:rPr>
+    </w:lvl>
+    <w:lvl w:ilvl="5" w:tentative="1">
+      <w:start w:val="1"/>
+      <w:numFmt w:val="bullet"/>
+      <w:lvlText w:val=""/>
+      <w:lvlJc w:val="left"/>
+      <w:pPr>
+        <w:tabs>
+          <w:tab w:val="num" w:pos="4320"/>
+        </w:tabs>
+        <w:ind w:left="4320" w:hanging="360"/>
+      </w:pPr>
+      <w:rPr>
+        <w:rFonts w:ascii="Wingdings" w:hAnsi="Wingdings" w:hint="default"/>
+        <w:sz w:val="20"/>
+      </w:rPr>
+    </w:lvl>
+    <w:lvl w:ilvl="6" w:tentative="1">
+      <w:start w:val="1"/>
+      <w:numFmt w:val="bullet"/>
+      <w:lvlText w:val=""/>
+      <w:lvlJc w:val="left"/>
+      <w:pPr>
+        <w:tabs>
+          <w:tab w:val="num" w:pos="5040"/>
+        </w:tabs>
+        <w:ind w:left="5040" w:hanging="360"/>
+      </w:pPr>
+      <w:rPr>
+        <w:rFonts w:ascii="Wingdings" w:hAnsi="Wingdings" w:hint="default"/>
+        <w:sz w:val="20"/>
+      </w:rPr>
+    </w:lvl>
+    <w:lvl w:ilvl="7" w:tentative="1">
+      <w:start w:val="1"/>
+      <w:numFmt w:val="bullet"/>
+      <w:lvlText w:val=""/>
+      <w:lvlJc w:val="left"/>
+      <w:pPr>
+        <w:tabs>
+          <w:tab w:val="num" w:pos="5760"/>
+        </w:tabs>
+        <w:ind w:left="5760" w:hanging="360"/>
+      </w:pPr>
+      <w:rPr>
+        <w:rFonts w:ascii="Wingdings" w:hAnsi="Wingdings" w:hint="default"/>
+        <w:sz w:val="20"/>
+      </w:rPr>
+    </w:lvl>
+    <w:lvl w:ilvl="8" w:tentative="1">
+      <w:start w:val="1"/>
+      <w:numFmt w:val="bullet"/>
+      <w:lvlText w:val=""/>
+      <w:lvlJc w:val="left"/>
+      <w:pPr>
+        <w:tabs>
+          <w:tab w:val="num" w:pos="6480"/>
+        </w:tabs>
+        <w:ind w:left="6480" w:hanging="360"/>
+      </w:pPr>
+      <w:rPr>
+        <w:rFonts w:ascii="Wingdings" w:hAnsi="Wingdings" w:hint="default"/>
+        <w:sz w:val="20"/>
+      </w:rPr>
+    </w:lvl>
+  </w:abstractNum>
+  <w:abstractNum w:abstractNumId="4" w15:restartNumberingAfterBreak="0">
     <w:nsid w:val="07045516"/>
     <w:multiLevelType w:val="hybridMultilevel"/>
     <w:tmpl w:val="0F34ADD8"/>
@@ -923,10 +2448,272 @@
       </w:rPr>
     </w:lvl>
   </w:abstractNum>
-  <w:abstractNum w:abstractNumId="3" w15:restartNumberingAfterBreak="0">
+  <w:abstractNum w:abstractNumId="5" w15:restartNumberingAfterBreak="0">
+    <w:nsid w:val="0BB95CB6"/>
+    <w:multiLevelType w:val="hybridMultilevel"/>
+    <w:tmpl w:val="D2F6A4D6"/>
+    <w:lvl w:ilvl="0" w:tplc="18090001">
+      <w:start w:val="1"/>
+      <w:numFmt w:val="bullet"/>
+      <w:lvlText w:val=""/>
+      <w:lvlJc w:val="left"/>
+      <w:pPr>
+        <w:ind w:left="720" w:hanging="360"/>
+      </w:pPr>
+      <w:rPr>
+        <w:rFonts w:ascii="Symbol" w:hAnsi="Symbol" w:hint="default"/>
+      </w:rPr>
+    </w:lvl>
+    <w:lvl w:ilvl="1" w:tplc="18090003" w:tentative="1">
+      <w:start w:val="1"/>
+      <w:numFmt w:val="bullet"/>
+      <w:lvlText w:val="o"/>
+      <w:lvlJc w:val="left"/>
+      <w:pPr>
+        <w:ind w:left="1440" w:hanging="360"/>
+      </w:pPr>
+      <w:rPr>
+        <w:rFonts w:ascii="Courier New" w:hAnsi="Courier New" w:cs="Courier New" w:hint="default"/>
+      </w:rPr>
+    </w:lvl>
+    <w:lvl w:ilvl="2" w:tplc="18090005" w:tentative="1">
+      <w:start w:val="1"/>
+      <w:numFmt w:val="bullet"/>
+      <w:lvlText w:val=""/>
+      <w:lvlJc w:val="left"/>
+      <w:pPr>
+        <w:ind w:left="2160" w:hanging="360"/>
+      </w:pPr>
+      <w:rPr>
+        <w:rFonts w:ascii="Wingdings" w:hAnsi="Wingdings" w:hint="default"/>
+      </w:rPr>
+    </w:lvl>
+    <w:lvl w:ilvl="3" w:tplc="18090001" w:tentative="1">
+      <w:start w:val="1"/>
+      <w:numFmt w:val="bullet"/>
+      <w:lvlText w:val=""/>
+      <w:lvlJc w:val="left"/>
+      <w:pPr>
+        <w:ind w:left="2880" w:hanging="360"/>
+      </w:pPr>
+      <w:rPr>
+        <w:rFonts w:ascii="Symbol" w:hAnsi="Symbol" w:hint="default"/>
+      </w:rPr>
+    </w:lvl>
+    <w:lvl w:ilvl="4" w:tplc="18090003" w:tentative="1">
+      <w:start w:val="1"/>
+      <w:numFmt w:val="bullet"/>
+      <w:lvlText w:val="o"/>
+      <w:lvlJc w:val="left"/>
+      <w:pPr>
+        <w:ind w:left="3600" w:hanging="360"/>
+      </w:pPr>
+      <w:rPr>
+        <w:rFonts w:ascii="Courier New" w:hAnsi="Courier New" w:cs="Courier New" w:hint="default"/>
+      </w:rPr>
+    </w:lvl>
+    <w:lvl w:ilvl="5" w:tplc="18090005" w:tentative="1">
+      <w:start w:val="1"/>
+      <w:numFmt w:val="bullet"/>
+      <w:lvlText w:val=""/>
+      <w:lvlJc w:val="left"/>
+      <w:pPr>
+        <w:ind w:left="4320" w:hanging="360"/>
+      </w:pPr>
+      <w:rPr>
+        <w:rFonts w:ascii="Wingdings" w:hAnsi="Wingdings" w:hint="default"/>
+      </w:rPr>
+    </w:lvl>
+    <w:lvl w:ilvl="6" w:tplc="18090001" w:tentative="1">
+      <w:start w:val="1"/>
+      <w:numFmt w:val="bullet"/>
+      <w:lvlText w:val=""/>
+      <w:lvlJc w:val="left"/>
+      <w:pPr>
+        <w:ind w:left="5040" w:hanging="360"/>
+      </w:pPr>
+      <w:rPr>
+        <w:rFonts w:ascii="Symbol" w:hAnsi="Symbol" w:hint="default"/>
+      </w:rPr>
+    </w:lvl>
+    <w:lvl w:ilvl="7" w:tplc="18090003" w:tentative="1">
+      <w:start w:val="1"/>
+      <w:numFmt w:val="bullet"/>
+      <w:lvlText w:val="o"/>
+      <w:lvlJc w:val="left"/>
+      <w:pPr>
+        <w:ind w:left="5760" w:hanging="360"/>
+      </w:pPr>
+      <w:rPr>
+        <w:rFonts w:ascii="Courier New" w:hAnsi="Courier New" w:cs="Courier New" w:hint="default"/>
+      </w:rPr>
+    </w:lvl>
+    <w:lvl w:ilvl="8" w:tplc="18090005" w:tentative="1">
+      <w:start w:val="1"/>
+      <w:numFmt w:val="bullet"/>
+      <w:lvlText w:val=""/>
+      <w:lvlJc w:val="left"/>
+      <w:pPr>
+        <w:ind w:left="6480" w:hanging="360"/>
+      </w:pPr>
+      <w:rPr>
+        <w:rFonts w:ascii="Wingdings" w:hAnsi="Wingdings" w:hint="default"/>
+      </w:rPr>
+    </w:lvl>
+  </w:abstractNum>
+  <w:abstractNum w:abstractNumId="6" w15:restartNumberingAfterBreak="0">
+    <w:nsid w:val="24F74569"/>
+    <w:multiLevelType w:val="multilevel"/>
+    <w:tmpl w:val="0110322A"/>
+    <w:lvl w:ilvl="0">
+      <w:start w:val="1"/>
+      <w:numFmt w:val="bullet"/>
+      <w:lvlText w:val=""/>
+      <w:lvlJc w:val="left"/>
+      <w:pPr>
+        <w:tabs>
+          <w:tab w:val="num" w:pos="720"/>
+        </w:tabs>
+        <w:ind w:left="720" w:hanging="360"/>
+      </w:pPr>
+      <w:rPr>
+        <w:rFonts w:ascii="Symbol" w:hAnsi="Symbol" w:hint="default"/>
+        <w:sz w:val="20"/>
+      </w:rPr>
+    </w:lvl>
+    <w:lvl w:ilvl="1" w:tentative="1">
+      <w:start w:val="1"/>
+      <w:numFmt w:val="bullet"/>
+      <w:lvlText w:val="o"/>
+      <w:lvlJc w:val="left"/>
+      <w:pPr>
+        <w:tabs>
+          <w:tab w:val="num" w:pos="1440"/>
+        </w:tabs>
+        <w:ind w:left="1440" w:hanging="360"/>
+      </w:pPr>
+      <w:rPr>
+        <w:rFonts w:ascii="Courier New" w:hAnsi="Courier New" w:hint="default"/>
+        <w:sz w:val="20"/>
+      </w:rPr>
+    </w:lvl>
+    <w:lvl w:ilvl="2" w:tentative="1">
+      <w:start w:val="1"/>
+      <w:numFmt w:val="bullet"/>
+      <w:lvlText w:val=""/>
+      <w:lvlJc w:val="left"/>
+      <w:pPr>
+        <w:tabs>
+          <w:tab w:val="num" w:pos="2160"/>
+        </w:tabs>
+        <w:ind w:left="2160" w:hanging="360"/>
+      </w:pPr>
+      <w:rPr>
+        <w:rFonts w:ascii="Wingdings" w:hAnsi="Wingdings" w:hint="default"/>
+        <w:sz w:val="20"/>
+      </w:rPr>
+    </w:lvl>
+    <w:lvl w:ilvl="3" w:tentative="1">
+      <w:start w:val="1"/>
+      <w:numFmt w:val="bullet"/>
+      <w:lvlText w:val=""/>
+      <w:lvlJc w:val="left"/>
+      <w:pPr>
+        <w:tabs>
+          <w:tab w:val="num" w:pos="2880"/>
+        </w:tabs>
+        <w:ind w:left="2880" w:hanging="360"/>
+      </w:pPr>
+      <w:rPr>
+        <w:rFonts w:ascii="Wingdings" w:hAnsi="Wingdings" w:hint="default"/>
+        <w:sz w:val="20"/>
+      </w:rPr>
+    </w:lvl>
+    <w:lvl w:ilvl="4" w:tentative="1">
+      <w:start w:val="1"/>
+      <w:numFmt w:val="bullet"/>
+      <w:lvlText w:val=""/>
+      <w:lvlJc w:val="left"/>
+      <w:pPr>
+        <w:tabs>
+          <w:tab w:val="num" w:pos="3600"/>
+        </w:tabs>
+        <w:ind w:left="3600" w:hanging="360"/>
+      </w:pPr>
+      <w:rPr>
+        <w:rFonts w:ascii="Wingdings" w:hAnsi="Wingdings" w:hint="default"/>
+        <w:sz w:val="20"/>
+      </w:rPr>
+    </w:lvl>
+    <w:lvl w:ilvl="5" w:tentative="1">
+      <w:start w:val="1"/>
+      <w:numFmt w:val="bullet"/>
+      <w:lvlText w:val=""/>
+      <w:lvlJc w:val="left"/>
+      <w:pPr>
+        <w:tabs>
+          <w:tab w:val="num" w:pos="4320"/>
+        </w:tabs>
+        <w:ind w:left="4320" w:hanging="360"/>
+      </w:pPr>
+      <w:rPr>
+        <w:rFonts w:ascii="Wingdings" w:hAnsi="Wingdings" w:hint="default"/>
+        <w:sz w:val="20"/>
+      </w:rPr>
+    </w:lvl>
+    <w:lvl w:ilvl="6" w:tentative="1">
+      <w:start w:val="1"/>
+      <w:numFmt w:val="bullet"/>
+      <w:lvlText w:val=""/>
+      <w:lvlJc w:val="left"/>
+      <w:pPr>
+        <w:tabs>
+          <w:tab w:val="num" w:pos="5040"/>
+        </w:tabs>
+        <w:ind w:left="5040" w:hanging="360"/>
+      </w:pPr>
+      <w:rPr>
+        <w:rFonts w:ascii="Wingdings" w:hAnsi="Wingdings" w:hint="default"/>
+        <w:sz w:val="20"/>
+      </w:rPr>
+    </w:lvl>
+    <w:lvl w:ilvl="7" w:tentative="1">
+      <w:start w:val="1"/>
+      <w:numFmt w:val="bullet"/>
+      <w:lvlText w:val=""/>
+      <w:lvlJc w:val="left"/>
+      <w:pPr>
+        <w:tabs>
+          <w:tab w:val="num" w:pos="5760"/>
+        </w:tabs>
+        <w:ind w:left="5760" w:hanging="360"/>
+      </w:pPr>
+      <w:rPr>
+        <w:rFonts w:ascii="Wingdings" w:hAnsi="Wingdings" w:hint="default"/>
+        <w:sz w:val="20"/>
+      </w:rPr>
+    </w:lvl>
+    <w:lvl w:ilvl="8" w:tentative="1">
+      <w:start w:val="1"/>
+      <w:numFmt w:val="bullet"/>
+      <w:lvlText w:val=""/>
+      <w:lvlJc w:val="left"/>
+      <w:pPr>
+        <w:tabs>
+          <w:tab w:val="num" w:pos="6480"/>
+        </w:tabs>
+        <w:ind w:left="6480" w:hanging="360"/>
+      </w:pPr>
+      <w:rPr>
+        <w:rFonts w:ascii="Wingdings" w:hAnsi="Wingdings" w:hint="default"/>
+        <w:sz w:val="20"/>
+      </w:rPr>
+    </w:lvl>
+  </w:abstractNum>
+  <w:abstractNum w:abstractNumId="7" w15:restartNumberingAfterBreak="0">
     <w:nsid w:val="298E62C0"/>
     <w:multiLevelType w:val="hybridMultilevel"/>
-    <w:tmpl w:val="891C7696"/>
+    <w:tmpl w:val="C94CEF64"/>
     <w:lvl w:ilvl="0" w:tplc="18090001">
       <w:start w:val="1"/>
       <w:numFmt w:val="bullet"/>
@@ -1036,7 +2823,7 @@
       </w:rPr>
     </w:lvl>
   </w:abstractNum>
-  <w:abstractNum w:abstractNumId="4" w15:restartNumberingAfterBreak="0">
+  <w:abstractNum w:abstractNumId="8" w15:restartNumberingAfterBreak="0">
     <w:nsid w:val="2BB32AFF"/>
     <w:multiLevelType w:val="hybridMultilevel"/>
     <w:tmpl w:val="69960D3C"/>
@@ -1149,7 +2936,7 @@
       </w:rPr>
     </w:lvl>
   </w:abstractNum>
-  <w:abstractNum w:abstractNumId="5" w15:restartNumberingAfterBreak="0">
+  <w:abstractNum w:abstractNumId="9" w15:restartNumberingAfterBreak="0">
     <w:nsid w:val="2C2E13A0"/>
     <w:multiLevelType w:val="hybridMultilevel"/>
     <w:tmpl w:val="A028B28A"/>
@@ -1262,7 +3049,156 @@
       </w:rPr>
     </w:lvl>
   </w:abstractNum>
-  <w:abstractNum w:abstractNumId="6" w15:restartNumberingAfterBreak="0">
+  <w:abstractNum w:abstractNumId="10" w15:restartNumberingAfterBreak="0">
+    <w:nsid w:val="3ADE2341"/>
+    <w:multiLevelType w:val="multilevel"/>
+    <w:tmpl w:val="53C648D0"/>
+    <w:lvl w:ilvl="0">
+      <w:start w:val="1"/>
+      <w:numFmt w:val="bullet"/>
+      <w:lvlText w:val=""/>
+      <w:lvlJc w:val="left"/>
+      <w:pPr>
+        <w:tabs>
+          <w:tab w:val="num" w:pos="720"/>
+        </w:tabs>
+        <w:ind w:left="720" w:hanging="360"/>
+      </w:pPr>
+      <w:rPr>
+        <w:rFonts w:ascii="Symbol" w:hAnsi="Symbol" w:hint="default"/>
+        <w:sz w:val="20"/>
+      </w:rPr>
+    </w:lvl>
+    <w:lvl w:ilvl="1" w:tentative="1">
+      <w:start w:val="1"/>
+      <w:numFmt w:val="bullet"/>
+      <w:lvlText w:val="o"/>
+      <w:lvlJc w:val="left"/>
+      <w:pPr>
+        <w:tabs>
+          <w:tab w:val="num" w:pos="1440"/>
+        </w:tabs>
+        <w:ind w:left="1440" w:hanging="360"/>
+      </w:pPr>
+      <w:rPr>
+        <w:rFonts w:ascii="Courier New" w:hAnsi="Courier New" w:hint="default"/>
+        <w:sz w:val="20"/>
+      </w:rPr>
+    </w:lvl>
+    <w:lvl w:ilvl="2" w:tentative="1">
+      <w:start w:val="1"/>
+      <w:numFmt w:val="bullet"/>
+      <w:lvlText w:val=""/>
+      <w:lvlJc w:val="left"/>
+      <w:pPr>
+        <w:tabs>
+          <w:tab w:val="num" w:pos="2160"/>
+        </w:tabs>
+        <w:ind w:left="2160" w:hanging="360"/>
+      </w:pPr>
+      <w:rPr>
+        <w:rFonts w:ascii="Wingdings" w:hAnsi="Wingdings" w:hint="default"/>
+        <w:sz w:val="20"/>
+      </w:rPr>
+    </w:lvl>
+    <w:lvl w:ilvl="3" w:tentative="1">
+      <w:start w:val="1"/>
+      <w:numFmt w:val="bullet"/>
+      <w:lvlText w:val=""/>
+      <w:lvlJc w:val="left"/>
+      <w:pPr>
+        <w:tabs>
+          <w:tab w:val="num" w:pos="2880"/>
+        </w:tabs>
+        <w:ind w:left="2880" w:hanging="360"/>
+      </w:pPr>
+      <w:rPr>
+        <w:rFonts w:ascii="Wingdings" w:hAnsi="Wingdings" w:hint="default"/>
+        <w:sz w:val="20"/>
+      </w:rPr>
+    </w:lvl>
+    <w:lvl w:ilvl="4" w:tentative="1">
+      <w:start w:val="1"/>
+      <w:numFmt w:val="bullet"/>
+      <w:lvlText w:val=""/>
+      <w:lvlJc w:val="left"/>
+      <w:pPr>
+        <w:tabs>
+          <w:tab w:val="num" w:pos="3600"/>
+        </w:tabs>
+        <w:ind w:left="3600" w:hanging="360"/>
+      </w:pPr>
+      <w:rPr>
+        <w:rFonts w:ascii="Wingdings" w:hAnsi="Wingdings" w:hint="default"/>
+        <w:sz w:val="20"/>
+      </w:rPr>
+    </w:lvl>
+    <w:lvl w:ilvl="5" w:tentative="1">
+      <w:start w:val="1"/>
+      <w:numFmt w:val="bullet"/>
+      <w:lvlText w:val=""/>
+      <w:lvlJc w:val="left"/>
+      <w:pPr>
+        <w:tabs>
+          <w:tab w:val="num" w:pos="4320"/>
+        </w:tabs>
+        <w:ind w:left="4320" w:hanging="360"/>
+      </w:pPr>
+      <w:rPr>
+        <w:rFonts w:ascii="Wingdings" w:hAnsi="Wingdings" w:hint="default"/>
+        <w:sz w:val="20"/>
+      </w:rPr>
+    </w:lvl>
+    <w:lvl w:ilvl="6" w:tentative="1">
+      <w:start w:val="1"/>
+      <w:numFmt w:val="bullet"/>
+      <w:lvlText w:val=""/>
+      <w:lvlJc w:val="left"/>
+      <w:pPr>
+        <w:tabs>
+          <w:tab w:val="num" w:pos="5040"/>
+        </w:tabs>
+        <w:ind w:left="5040" w:hanging="360"/>
+      </w:pPr>
+      <w:rPr>
+        <w:rFonts w:ascii="Wingdings" w:hAnsi="Wingdings" w:hint="default"/>
+        <w:sz w:val="20"/>
+      </w:rPr>
+    </w:lvl>
+    <w:lvl w:ilvl="7" w:tentative="1">
+      <w:start w:val="1"/>
+      <w:numFmt w:val="bullet"/>
+      <w:lvlText w:val=""/>
+      <w:lvlJc w:val="left"/>
+      <w:pPr>
+        <w:tabs>
+          <w:tab w:val="num" w:pos="5760"/>
+        </w:tabs>
+        <w:ind w:left="5760" w:hanging="360"/>
+      </w:pPr>
+      <w:rPr>
+        <w:rFonts w:ascii="Wingdings" w:hAnsi="Wingdings" w:hint="default"/>
+        <w:sz w:val="20"/>
+      </w:rPr>
+    </w:lvl>
+    <w:lvl w:ilvl="8" w:tentative="1">
+      <w:start w:val="1"/>
+      <w:numFmt w:val="bullet"/>
+      <w:lvlText w:val=""/>
+      <w:lvlJc w:val="left"/>
+      <w:pPr>
+        <w:tabs>
+          <w:tab w:val="num" w:pos="6480"/>
+        </w:tabs>
+        <w:ind w:left="6480" w:hanging="360"/>
+      </w:pPr>
+      <w:rPr>
+        <w:rFonts w:ascii="Wingdings" w:hAnsi="Wingdings" w:hint="default"/>
+        <w:sz w:val="20"/>
+      </w:rPr>
+    </w:lvl>
+  </w:abstractNum>
+  <w:abstractNum w:abstractNumId="11" w15:restartNumberingAfterBreak="0">
     <w:nsid w:val="3DA81AB2"/>
     <w:multiLevelType w:val="hybridMultilevel"/>
     <w:tmpl w:val="94840F48"/>
@@ -1375,7 +3311,7 @@
       </w:rPr>
     </w:lvl>
   </w:abstractNum>
-  <w:abstractNum w:abstractNumId="7" w15:restartNumberingAfterBreak="0">
+  <w:abstractNum w:abstractNumId="12" w15:restartNumberingAfterBreak="0">
     <w:nsid w:val="43C35FF2"/>
     <w:multiLevelType w:val="hybridMultilevel"/>
     <w:tmpl w:val="026641EA"/>
@@ -1488,7 +3424,156 @@
       </w:rPr>
     </w:lvl>
   </w:abstractNum>
-  <w:abstractNum w:abstractNumId="8" w15:restartNumberingAfterBreak="0">
+  <w:abstractNum w:abstractNumId="13" w15:restartNumberingAfterBreak="0">
+    <w:nsid w:val="478D2D08"/>
+    <w:multiLevelType w:val="multilevel"/>
+    <w:tmpl w:val="7864FF18"/>
+    <w:lvl w:ilvl="0">
+      <w:start w:val="1"/>
+      <w:numFmt w:val="bullet"/>
+      <w:lvlText w:val=""/>
+      <w:lvlJc w:val="left"/>
+      <w:pPr>
+        <w:tabs>
+          <w:tab w:val="num" w:pos="720"/>
+        </w:tabs>
+        <w:ind w:left="720" w:hanging="360"/>
+      </w:pPr>
+      <w:rPr>
+        <w:rFonts w:ascii="Symbol" w:hAnsi="Symbol" w:hint="default"/>
+        <w:sz w:val="20"/>
+      </w:rPr>
+    </w:lvl>
+    <w:lvl w:ilvl="1" w:tentative="1">
+      <w:start w:val="1"/>
+      <w:numFmt w:val="bullet"/>
+      <w:lvlText w:val="o"/>
+      <w:lvlJc w:val="left"/>
+      <w:pPr>
+        <w:tabs>
+          <w:tab w:val="num" w:pos="1440"/>
+        </w:tabs>
+        <w:ind w:left="1440" w:hanging="360"/>
+      </w:pPr>
+      <w:rPr>
+        <w:rFonts w:ascii="Courier New" w:hAnsi="Courier New" w:hint="default"/>
+        <w:sz w:val="20"/>
+      </w:rPr>
+    </w:lvl>
+    <w:lvl w:ilvl="2" w:tentative="1">
+      <w:start w:val="1"/>
+      <w:numFmt w:val="bullet"/>
+      <w:lvlText w:val=""/>
+      <w:lvlJc w:val="left"/>
+      <w:pPr>
+        <w:tabs>
+          <w:tab w:val="num" w:pos="2160"/>
+        </w:tabs>
+        <w:ind w:left="2160" w:hanging="360"/>
+      </w:pPr>
+      <w:rPr>
+        <w:rFonts w:ascii="Wingdings" w:hAnsi="Wingdings" w:hint="default"/>
+        <w:sz w:val="20"/>
+      </w:rPr>
+    </w:lvl>
+    <w:lvl w:ilvl="3" w:tentative="1">
+      <w:start w:val="1"/>
+      <w:numFmt w:val="bullet"/>
+      <w:lvlText w:val=""/>
+      <w:lvlJc w:val="left"/>
+      <w:pPr>
+        <w:tabs>
+          <w:tab w:val="num" w:pos="2880"/>
+        </w:tabs>
+        <w:ind w:left="2880" w:hanging="360"/>
+      </w:pPr>
+      <w:rPr>
+        <w:rFonts w:ascii="Wingdings" w:hAnsi="Wingdings" w:hint="default"/>
+        <w:sz w:val="20"/>
+      </w:rPr>
+    </w:lvl>
+    <w:lvl w:ilvl="4" w:tentative="1">
+      <w:start w:val="1"/>
+      <w:numFmt w:val="bullet"/>
+      <w:lvlText w:val=""/>
+      <w:lvlJc w:val="left"/>
+      <w:pPr>
+        <w:tabs>
+          <w:tab w:val="num" w:pos="3600"/>
+        </w:tabs>
+        <w:ind w:left="3600" w:hanging="360"/>
+      </w:pPr>
+      <w:rPr>
+        <w:rFonts w:ascii="Wingdings" w:hAnsi="Wingdings" w:hint="default"/>
+        <w:sz w:val="20"/>
+      </w:rPr>
+    </w:lvl>
+    <w:lvl w:ilvl="5" w:tentative="1">
+      <w:start w:val="1"/>
+      <w:numFmt w:val="bullet"/>
+      <w:lvlText w:val=""/>
+      <w:lvlJc w:val="left"/>
+      <w:pPr>
+        <w:tabs>
+          <w:tab w:val="num" w:pos="4320"/>
+        </w:tabs>
+        <w:ind w:left="4320" w:hanging="360"/>
+      </w:pPr>
+      <w:rPr>
+        <w:rFonts w:ascii="Wingdings" w:hAnsi="Wingdings" w:hint="default"/>
+        <w:sz w:val="20"/>
+      </w:rPr>
+    </w:lvl>
+    <w:lvl w:ilvl="6" w:tentative="1">
+      <w:start w:val="1"/>
+      <w:numFmt w:val="bullet"/>
+      <w:lvlText w:val=""/>
+      <w:lvlJc w:val="left"/>
+      <w:pPr>
+        <w:tabs>
+          <w:tab w:val="num" w:pos="5040"/>
+        </w:tabs>
+        <w:ind w:left="5040" w:hanging="360"/>
+      </w:pPr>
+      <w:rPr>
+        <w:rFonts w:ascii="Wingdings" w:hAnsi="Wingdings" w:hint="default"/>
+        <w:sz w:val="20"/>
+      </w:rPr>
+    </w:lvl>
+    <w:lvl w:ilvl="7" w:tentative="1">
+      <w:start w:val="1"/>
+      <w:numFmt w:val="bullet"/>
+      <w:lvlText w:val=""/>
+      <w:lvlJc w:val="left"/>
+      <w:pPr>
+        <w:tabs>
+          <w:tab w:val="num" w:pos="5760"/>
+        </w:tabs>
+        <w:ind w:left="5760" w:hanging="360"/>
+      </w:pPr>
+      <w:rPr>
+        <w:rFonts w:ascii="Wingdings" w:hAnsi="Wingdings" w:hint="default"/>
+        <w:sz w:val="20"/>
+      </w:rPr>
+    </w:lvl>
+    <w:lvl w:ilvl="8" w:tentative="1">
+      <w:start w:val="1"/>
+      <w:numFmt w:val="bullet"/>
+      <w:lvlText w:val=""/>
+      <w:lvlJc w:val="left"/>
+      <w:pPr>
+        <w:tabs>
+          <w:tab w:val="num" w:pos="6480"/>
+        </w:tabs>
+        <w:ind w:left="6480" w:hanging="360"/>
+      </w:pPr>
+      <w:rPr>
+        <w:rFonts w:ascii="Wingdings" w:hAnsi="Wingdings" w:hint="default"/>
+        <w:sz w:val="20"/>
+      </w:rPr>
+    </w:lvl>
+  </w:abstractNum>
+  <w:abstractNum w:abstractNumId="14" w15:restartNumberingAfterBreak="0">
     <w:nsid w:val="4AEE4D37"/>
     <w:multiLevelType w:val="multilevel"/>
     <w:tmpl w:val="E88CED36"/>
@@ -1601,7 +3686,7 @@
       </w:pPr>
     </w:lvl>
   </w:abstractNum>
-  <w:abstractNum w:abstractNumId="9" w15:restartNumberingAfterBreak="0">
+  <w:abstractNum w:abstractNumId="15" w15:restartNumberingAfterBreak="0">
     <w:nsid w:val="4D810E96"/>
     <w:multiLevelType w:val="hybridMultilevel"/>
     <w:tmpl w:val="39D40C38"/>
@@ -1714,7 +3799,156 @@
       </w:rPr>
     </w:lvl>
   </w:abstractNum>
-  <w:abstractNum w:abstractNumId="10" w15:restartNumberingAfterBreak="0">
+  <w:abstractNum w:abstractNumId="16" w15:restartNumberingAfterBreak="0">
+    <w:nsid w:val="4F8D0B89"/>
+    <w:multiLevelType w:val="multilevel"/>
+    <w:tmpl w:val="7B165A7A"/>
+    <w:lvl w:ilvl="0">
+      <w:start w:val="1"/>
+      <w:numFmt w:val="bullet"/>
+      <w:lvlText w:val=""/>
+      <w:lvlJc w:val="left"/>
+      <w:pPr>
+        <w:tabs>
+          <w:tab w:val="num" w:pos="720"/>
+        </w:tabs>
+        <w:ind w:left="720" w:hanging="360"/>
+      </w:pPr>
+      <w:rPr>
+        <w:rFonts w:ascii="Symbol" w:hAnsi="Symbol" w:hint="default"/>
+        <w:sz w:val="20"/>
+      </w:rPr>
+    </w:lvl>
+    <w:lvl w:ilvl="1" w:tentative="1">
+      <w:start w:val="1"/>
+      <w:numFmt w:val="bullet"/>
+      <w:lvlText w:val="o"/>
+      <w:lvlJc w:val="left"/>
+      <w:pPr>
+        <w:tabs>
+          <w:tab w:val="num" w:pos="1440"/>
+        </w:tabs>
+        <w:ind w:left="1440" w:hanging="360"/>
+      </w:pPr>
+      <w:rPr>
+        <w:rFonts w:ascii="Courier New" w:hAnsi="Courier New" w:hint="default"/>
+        <w:sz w:val="20"/>
+      </w:rPr>
+    </w:lvl>
+    <w:lvl w:ilvl="2" w:tentative="1">
+      <w:start w:val="1"/>
+      <w:numFmt w:val="bullet"/>
+      <w:lvlText w:val=""/>
+      <w:lvlJc w:val="left"/>
+      <w:pPr>
+        <w:tabs>
+          <w:tab w:val="num" w:pos="2160"/>
+        </w:tabs>
+        <w:ind w:left="2160" w:hanging="360"/>
+      </w:pPr>
+      <w:rPr>
+        <w:rFonts w:ascii="Wingdings" w:hAnsi="Wingdings" w:hint="default"/>
+        <w:sz w:val="20"/>
+      </w:rPr>
+    </w:lvl>
+    <w:lvl w:ilvl="3" w:tentative="1">
+      <w:start w:val="1"/>
+      <w:numFmt w:val="bullet"/>
+      <w:lvlText w:val=""/>
+      <w:lvlJc w:val="left"/>
+      <w:pPr>
+        <w:tabs>
+          <w:tab w:val="num" w:pos="2880"/>
+        </w:tabs>
+        <w:ind w:left="2880" w:hanging="360"/>
+      </w:pPr>
+      <w:rPr>
+        <w:rFonts w:ascii="Wingdings" w:hAnsi="Wingdings" w:hint="default"/>
+        <w:sz w:val="20"/>
+      </w:rPr>
+    </w:lvl>
+    <w:lvl w:ilvl="4" w:tentative="1">
+      <w:start w:val="1"/>
+      <w:numFmt w:val="bullet"/>
+      <w:lvlText w:val=""/>
+      <w:lvlJc w:val="left"/>
+      <w:pPr>
+        <w:tabs>
+          <w:tab w:val="num" w:pos="3600"/>
+        </w:tabs>
+        <w:ind w:left="3600" w:hanging="360"/>
+      </w:pPr>
+      <w:rPr>
+        <w:rFonts w:ascii="Wingdings" w:hAnsi="Wingdings" w:hint="default"/>
+        <w:sz w:val="20"/>
+      </w:rPr>
+    </w:lvl>
+    <w:lvl w:ilvl="5" w:tentative="1">
+      <w:start w:val="1"/>
+      <w:numFmt w:val="bullet"/>
+      <w:lvlText w:val=""/>
+      <w:lvlJc w:val="left"/>
+      <w:pPr>
+        <w:tabs>
+          <w:tab w:val="num" w:pos="4320"/>
+        </w:tabs>
+        <w:ind w:left="4320" w:hanging="360"/>
+      </w:pPr>
+      <w:rPr>
+        <w:rFonts w:ascii="Wingdings" w:hAnsi="Wingdings" w:hint="default"/>
+        <w:sz w:val="20"/>
+      </w:rPr>
+    </w:lvl>
+    <w:lvl w:ilvl="6" w:tentative="1">
+      <w:start w:val="1"/>
+      <w:numFmt w:val="bullet"/>
+      <w:lvlText w:val=""/>
+      <w:lvlJc w:val="left"/>
+      <w:pPr>
+        <w:tabs>
+          <w:tab w:val="num" w:pos="5040"/>
+        </w:tabs>
+        <w:ind w:left="5040" w:hanging="360"/>
+      </w:pPr>
+      <w:rPr>
+        <w:rFonts w:ascii="Wingdings" w:hAnsi="Wingdings" w:hint="default"/>
+        <w:sz w:val="20"/>
+      </w:rPr>
+    </w:lvl>
+    <w:lvl w:ilvl="7" w:tentative="1">
+      <w:start w:val="1"/>
+      <w:numFmt w:val="bullet"/>
+      <w:lvlText w:val=""/>
+      <w:lvlJc w:val="left"/>
+      <w:pPr>
+        <w:tabs>
+          <w:tab w:val="num" w:pos="5760"/>
+        </w:tabs>
+        <w:ind w:left="5760" w:hanging="360"/>
+      </w:pPr>
+      <w:rPr>
+        <w:rFonts w:ascii="Wingdings" w:hAnsi="Wingdings" w:hint="default"/>
+        <w:sz w:val="20"/>
+      </w:rPr>
+    </w:lvl>
+    <w:lvl w:ilvl="8" w:tentative="1">
+      <w:start w:val="1"/>
+      <w:numFmt w:val="bullet"/>
+      <w:lvlText w:val=""/>
+      <w:lvlJc w:val="left"/>
+      <w:pPr>
+        <w:tabs>
+          <w:tab w:val="num" w:pos="6480"/>
+        </w:tabs>
+        <w:ind w:left="6480" w:hanging="360"/>
+      </w:pPr>
+      <w:rPr>
+        <w:rFonts w:ascii="Wingdings" w:hAnsi="Wingdings" w:hint="default"/>
+        <w:sz w:val="20"/>
+      </w:rPr>
+    </w:lvl>
+  </w:abstractNum>
+  <w:abstractNum w:abstractNumId="17" w15:restartNumberingAfterBreak="0">
     <w:nsid w:val="536055B0"/>
     <w:multiLevelType w:val="multilevel"/>
     <w:tmpl w:val="0406BAAA"/>
@@ -1831,7 +4065,7 @@
       </w:pPr>
     </w:lvl>
   </w:abstractNum>
-  <w:abstractNum w:abstractNumId="11" w15:restartNumberingAfterBreak="0">
+  <w:abstractNum w:abstractNumId="18" w15:restartNumberingAfterBreak="0">
     <w:nsid w:val="5E0A7FC5"/>
     <w:multiLevelType w:val="hybridMultilevel"/>
     <w:tmpl w:val="F90A7F60"/>
@@ -1944,7 +4178,7 @@
       </w:rPr>
     </w:lvl>
   </w:abstractNum>
-  <w:abstractNum w:abstractNumId="12" w15:restartNumberingAfterBreak="0">
+  <w:abstractNum w:abstractNumId="19" w15:restartNumberingAfterBreak="0">
     <w:nsid w:val="5F033242"/>
     <w:multiLevelType w:val="hybridMultilevel"/>
     <w:tmpl w:val="A7D40B62"/>
@@ -2057,7 +4291,418 @@
       </w:rPr>
     </w:lvl>
   </w:abstractNum>
-  <w:abstractNum w:abstractNumId="13" w15:restartNumberingAfterBreak="0">
+  <w:abstractNum w:abstractNumId="20" w15:restartNumberingAfterBreak="0">
+    <w:nsid w:val="5FBA2BBD"/>
+    <w:multiLevelType w:val="multilevel"/>
+    <w:tmpl w:val="3A567022"/>
+    <w:lvl w:ilvl="0">
+      <w:start w:val="1"/>
+      <w:numFmt w:val="bullet"/>
+      <w:lvlText w:val=""/>
+      <w:lvlJc w:val="left"/>
+      <w:pPr>
+        <w:tabs>
+          <w:tab w:val="num" w:pos="720"/>
+        </w:tabs>
+        <w:ind w:left="720" w:hanging="360"/>
+      </w:pPr>
+      <w:rPr>
+        <w:rFonts w:ascii="Symbol" w:hAnsi="Symbol" w:hint="default"/>
+        <w:sz w:val="20"/>
+      </w:rPr>
+    </w:lvl>
+    <w:lvl w:ilvl="1" w:tentative="1">
+      <w:start w:val="1"/>
+      <w:numFmt w:val="bullet"/>
+      <w:lvlText w:val="o"/>
+      <w:lvlJc w:val="left"/>
+      <w:pPr>
+        <w:tabs>
+          <w:tab w:val="num" w:pos="1440"/>
+        </w:tabs>
+        <w:ind w:left="1440" w:hanging="360"/>
+      </w:pPr>
+      <w:rPr>
+        <w:rFonts w:ascii="Courier New" w:hAnsi="Courier New" w:hint="default"/>
+        <w:sz w:val="20"/>
+      </w:rPr>
+    </w:lvl>
+    <w:lvl w:ilvl="2" w:tentative="1">
+      <w:start w:val="1"/>
+      <w:numFmt w:val="bullet"/>
+      <w:lvlText w:val=""/>
+      <w:lvlJc w:val="left"/>
+      <w:pPr>
+        <w:tabs>
+          <w:tab w:val="num" w:pos="2160"/>
+        </w:tabs>
+        <w:ind w:left="2160" w:hanging="360"/>
+      </w:pPr>
+      <w:rPr>
+        <w:rFonts w:ascii="Wingdings" w:hAnsi="Wingdings" w:hint="default"/>
+        <w:sz w:val="20"/>
+      </w:rPr>
+    </w:lvl>
+    <w:lvl w:ilvl="3" w:tentative="1">
+      <w:start w:val="1"/>
+      <w:numFmt w:val="bullet"/>
+      <w:lvlText w:val=""/>
+      <w:lvlJc w:val="left"/>
+      <w:pPr>
+        <w:tabs>
+          <w:tab w:val="num" w:pos="2880"/>
+        </w:tabs>
+        <w:ind w:left="2880" w:hanging="360"/>
+      </w:pPr>
+      <w:rPr>
+        <w:rFonts w:ascii="Wingdings" w:hAnsi="Wingdings" w:hint="default"/>
+        <w:sz w:val="20"/>
+      </w:rPr>
+    </w:lvl>
+    <w:lvl w:ilvl="4" w:tentative="1">
+      <w:start w:val="1"/>
+      <w:numFmt w:val="bullet"/>
+      <w:lvlText w:val=""/>
+      <w:lvlJc w:val="left"/>
+      <w:pPr>
+        <w:tabs>
+          <w:tab w:val="num" w:pos="3600"/>
+        </w:tabs>
+        <w:ind w:left="3600" w:hanging="360"/>
+      </w:pPr>
+      <w:rPr>
+        <w:rFonts w:ascii="Wingdings" w:hAnsi="Wingdings" w:hint="default"/>
+        <w:sz w:val="20"/>
+      </w:rPr>
+    </w:lvl>
+    <w:lvl w:ilvl="5" w:tentative="1">
+      <w:start w:val="1"/>
+      <w:numFmt w:val="bullet"/>
+      <w:lvlText w:val=""/>
+      <w:lvlJc w:val="left"/>
+      <w:pPr>
+        <w:tabs>
+          <w:tab w:val="num" w:pos="4320"/>
+        </w:tabs>
+        <w:ind w:left="4320" w:hanging="360"/>
+      </w:pPr>
+      <w:rPr>
+        <w:rFonts w:ascii="Wingdings" w:hAnsi="Wingdings" w:hint="default"/>
+        <w:sz w:val="20"/>
+      </w:rPr>
+    </w:lvl>
+    <w:lvl w:ilvl="6" w:tentative="1">
+      <w:start w:val="1"/>
+      <w:numFmt w:val="bullet"/>
+      <w:lvlText w:val=""/>
+      <w:lvlJc w:val="left"/>
+      <w:pPr>
+        <w:tabs>
+          <w:tab w:val="num" w:pos="5040"/>
+        </w:tabs>
+        <w:ind w:left="5040" w:hanging="360"/>
+      </w:pPr>
+      <w:rPr>
+        <w:rFonts w:ascii="Wingdings" w:hAnsi="Wingdings" w:hint="default"/>
+        <w:sz w:val="20"/>
+      </w:rPr>
+    </w:lvl>
+    <w:lvl w:ilvl="7" w:tentative="1">
+      <w:start w:val="1"/>
+      <w:numFmt w:val="bullet"/>
+      <w:lvlText w:val=""/>
+      <w:lvlJc w:val="left"/>
+      <w:pPr>
+        <w:tabs>
+          <w:tab w:val="num" w:pos="5760"/>
+        </w:tabs>
+        <w:ind w:left="5760" w:hanging="360"/>
+      </w:pPr>
+      <w:rPr>
+        <w:rFonts w:ascii="Wingdings" w:hAnsi="Wingdings" w:hint="default"/>
+        <w:sz w:val="20"/>
+      </w:rPr>
+    </w:lvl>
+    <w:lvl w:ilvl="8" w:tentative="1">
+      <w:start w:val="1"/>
+      <w:numFmt w:val="bullet"/>
+      <w:lvlText w:val=""/>
+      <w:lvlJc w:val="left"/>
+      <w:pPr>
+        <w:tabs>
+          <w:tab w:val="num" w:pos="6480"/>
+        </w:tabs>
+        <w:ind w:left="6480" w:hanging="360"/>
+      </w:pPr>
+      <w:rPr>
+        <w:rFonts w:ascii="Wingdings" w:hAnsi="Wingdings" w:hint="default"/>
+        <w:sz w:val="20"/>
+      </w:rPr>
+    </w:lvl>
+  </w:abstractNum>
+  <w:abstractNum w:abstractNumId="21" w15:restartNumberingAfterBreak="0">
+    <w:nsid w:val="64D623D8"/>
+    <w:multiLevelType w:val="multilevel"/>
+    <w:tmpl w:val="7BEED4C0"/>
+    <w:lvl w:ilvl="0">
+      <w:start w:val="1"/>
+      <w:numFmt w:val="bullet"/>
+      <w:lvlText w:val=""/>
+      <w:lvlJc w:val="left"/>
+      <w:pPr>
+        <w:tabs>
+          <w:tab w:val="num" w:pos="720"/>
+        </w:tabs>
+        <w:ind w:left="720" w:hanging="360"/>
+      </w:pPr>
+      <w:rPr>
+        <w:rFonts w:ascii="Symbol" w:hAnsi="Symbol" w:hint="default"/>
+        <w:sz w:val="20"/>
+      </w:rPr>
+    </w:lvl>
+    <w:lvl w:ilvl="1" w:tentative="1">
+      <w:start w:val="1"/>
+      <w:numFmt w:val="bullet"/>
+      <w:lvlText w:val="o"/>
+      <w:lvlJc w:val="left"/>
+      <w:pPr>
+        <w:tabs>
+          <w:tab w:val="num" w:pos="1440"/>
+        </w:tabs>
+        <w:ind w:left="1440" w:hanging="360"/>
+      </w:pPr>
+      <w:rPr>
+        <w:rFonts w:ascii="Courier New" w:hAnsi="Courier New" w:hint="default"/>
+        <w:sz w:val="20"/>
+      </w:rPr>
+    </w:lvl>
+    <w:lvl w:ilvl="2" w:tentative="1">
+      <w:start w:val="1"/>
+      <w:numFmt w:val="bullet"/>
+      <w:lvlText w:val=""/>
+      <w:lvlJc w:val="left"/>
+      <w:pPr>
+        <w:tabs>
+          <w:tab w:val="num" w:pos="2160"/>
+        </w:tabs>
+        <w:ind w:left="2160" w:hanging="360"/>
+      </w:pPr>
+      <w:rPr>
+        <w:rFonts w:ascii="Wingdings" w:hAnsi="Wingdings" w:hint="default"/>
+        <w:sz w:val="20"/>
+      </w:rPr>
+    </w:lvl>
+    <w:lvl w:ilvl="3" w:tentative="1">
+      <w:start w:val="1"/>
+      <w:numFmt w:val="bullet"/>
+      <w:lvlText w:val=""/>
+      <w:lvlJc w:val="left"/>
+      <w:pPr>
+        <w:tabs>
+          <w:tab w:val="num" w:pos="2880"/>
+        </w:tabs>
+        <w:ind w:left="2880" w:hanging="360"/>
+      </w:pPr>
+      <w:rPr>
+        <w:rFonts w:ascii="Wingdings" w:hAnsi="Wingdings" w:hint="default"/>
+        <w:sz w:val="20"/>
+      </w:rPr>
+    </w:lvl>
+    <w:lvl w:ilvl="4" w:tentative="1">
+      <w:start w:val="1"/>
+      <w:numFmt w:val="bullet"/>
+      <w:lvlText w:val=""/>
+      <w:lvlJc w:val="left"/>
+      <w:pPr>
+        <w:tabs>
+          <w:tab w:val="num" w:pos="3600"/>
+        </w:tabs>
+        <w:ind w:left="3600" w:hanging="360"/>
+      </w:pPr>
+      <w:rPr>
+        <w:rFonts w:ascii="Wingdings" w:hAnsi="Wingdings" w:hint="default"/>
+        <w:sz w:val="20"/>
+      </w:rPr>
+    </w:lvl>
+    <w:lvl w:ilvl="5" w:tentative="1">
+      <w:start w:val="1"/>
+      <w:numFmt w:val="bullet"/>
+      <w:lvlText w:val=""/>
+      <w:lvlJc w:val="left"/>
+      <w:pPr>
+        <w:tabs>
+          <w:tab w:val="num" w:pos="4320"/>
+        </w:tabs>
+        <w:ind w:left="4320" w:hanging="360"/>
+      </w:pPr>
+      <w:rPr>
+        <w:rFonts w:ascii="Wingdings" w:hAnsi="Wingdings" w:hint="default"/>
+        <w:sz w:val="20"/>
+      </w:rPr>
+    </w:lvl>
+    <w:lvl w:ilvl="6" w:tentative="1">
+      <w:start w:val="1"/>
+      <w:numFmt w:val="bullet"/>
+      <w:lvlText w:val=""/>
+      <w:lvlJc w:val="left"/>
+      <w:pPr>
+        <w:tabs>
+          <w:tab w:val="num" w:pos="5040"/>
+        </w:tabs>
+        <w:ind w:left="5040" w:hanging="360"/>
+      </w:pPr>
+      <w:rPr>
+        <w:rFonts w:ascii="Wingdings" w:hAnsi="Wingdings" w:hint="default"/>
+        <w:sz w:val="20"/>
+      </w:rPr>
+    </w:lvl>
+    <w:lvl w:ilvl="7" w:tentative="1">
+      <w:start w:val="1"/>
+      <w:numFmt w:val="bullet"/>
+      <w:lvlText w:val=""/>
+      <w:lvlJc w:val="left"/>
+      <w:pPr>
+        <w:tabs>
+          <w:tab w:val="num" w:pos="5760"/>
+        </w:tabs>
+        <w:ind w:left="5760" w:hanging="360"/>
+      </w:pPr>
+      <w:rPr>
+        <w:rFonts w:ascii="Wingdings" w:hAnsi="Wingdings" w:hint="default"/>
+        <w:sz w:val="20"/>
+      </w:rPr>
+    </w:lvl>
+    <w:lvl w:ilvl="8" w:tentative="1">
+      <w:start w:val="1"/>
+      <w:numFmt w:val="bullet"/>
+      <w:lvlText w:val=""/>
+      <w:lvlJc w:val="left"/>
+      <w:pPr>
+        <w:tabs>
+          <w:tab w:val="num" w:pos="6480"/>
+        </w:tabs>
+        <w:ind w:left="6480" w:hanging="360"/>
+      </w:pPr>
+      <w:rPr>
+        <w:rFonts w:ascii="Wingdings" w:hAnsi="Wingdings" w:hint="default"/>
+        <w:sz w:val="20"/>
+      </w:rPr>
+    </w:lvl>
+  </w:abstractNum>
+  <w:abstractNum w:abstractNumId="22" w15:restartNumberingAfterBreak="0">
+    <w:nsid w:val="68DC178E"/>
+    <w:multiLevelType w:val="hybridMultilevel"/>
+    <w:tmpl w:val="94D8BCA0"/>
+    <w:lvl w:ilvl="0" w:tplc="18090001">
+      <w:start w:val="1"/>
+      <w:numFmt w:val="bullet"/>
+      <w:lvlText w:val=""/>
+      <w:lvlJc w:val="left"/>
+      <w:pPr>
+        <w:ind w:left="720" w:hanging="360"/>
+      </w:pPr>
+      <w:rPr>
+        <w:rFonts w:ascii="Symbol" w:hAnsi="Symbol" w:hint="default"/>
+      </w:rPr>
+    </w:lvl>
+    <w:lvl w:ilvl="1" w:tplc="18090003" w:tentative="1">
+      <w:start w:val="1"/>
+      <w:numFmt w:val="bullet"/>
+      <w:lvlText w:val="o"/>
+      <w:lvlJc w:val="left"/>
+      <w:pPr>
+        <w:ind w:left="1440" w:hanging="360"/>
+      </w:pPr>
+      <w:rPr>
+        <w:rFonts w:ascii="Courier New" w:hAnsi="Courier New" w:cs="Courier New" w:hint="default"/>
+      </w:rPr>
+    </w:lvl>
+    <w:lvl w:ilvl="2" w:tplc="18090005" w:tentative="1">
+      <w:start w:val="1"/>
+      <w:numFmt w:val="bullet"/>
+      <w:lvlText w:val=""/>
+      <w:lvlJc w:val="left"/>
+      <w:pPr>
+        <w:ind w:left="2160" w:hanging="360"/>
+      </w:pPr>
+      <w:rPr>
+        <w:rFonts w:ascii="Wingdings" w:hAnsi="Wingdings" w:hint="default"/>
+      </w:rPr>
+    </w:lvl>
+    <w:lvl w:ilvl="3" w:tplc="18090001" w:tentative="1">
+      <w:start w:val="1"/>
+      <w:numFmt w:val="bullet"/>
+      <w:lvlText w:val=""/>
+      <w:lvlJc w:val="left"/>
+      <w:pPr>
+        <w:ind w:left="2880" w:hanging="360"/>
+      </w:pPr>
+      <w:rPr>
+        <w:rFonts w:ascii="Symbol" w:hAnsi="Symbol" w:hint="default"/>
+      </w:rPr>
+    </w:lvl>
+    <w:lvl w:ilvl="4" w:tplc="18090003" w:tentative="1">
+      <w:start w:val="1"/>
+      <w:numFmt w:val="bullet"/>
+      <w:lvlText w:val="o"/>
+      <w:lvlJc w:val="left"/>
+      <w:pPr>
+        <w:ind w:left="3600" w:hanging="360"/>
+      </w:pPr>
+      <w:rPr>
+        <w:rFonts w:ascii="Courier New" w:hAnsi="Courier New" w:cs="Courier New" w:hint="default"/>
+      </w:rPr>
+    </w:lvl>
+    <w:lvl w:ilvl="5" w:tplc="18090005" w:tentative="1">
+      <w:start w:val="1"/>
+      <w:numFmt w:val="bullet"/>
+      <w:lvlText w:val=""/>
+      <w:lvlJc w:val="left"/>
+      <w:pPr>
+        <w:ind w:left="4320" w:hanging="360"/>
+      </w:pPr>
+      <w:rPr>
+        <w:rFonts w:ascii="Wingdings" w:hAnsi="Wingdings" w:hint="default"/>
+      </w:rPr>
+    </w:lvl>
+    <w:lvl w:ilvl="6" w:tplc="18090001" w:tentative="1">
+      <w:start w:val="1"/>
+      <w:numFmt w:val="bullet"/>
+      <w:lvlText w:val=""/>
+      <w:lvlJc w:val="left"/>
+      <w:pPr>
+        <w:ind w:left="5040" w:hanging="360"/>
+      </w:pPr>
+      <w:rPr>
+        <w:rFonts w:ascii="Symbol" w:hAnsi="Symbol" w:hint="default"/>
+      </w:rPr>
+    </w:lvl>
+    <w:lvl w:ilvl="7" w:tplc="18090003" w:tentative="1">
+      <w:start w:val="1"/>
+      <w:numFmt w:val="bullet"/>
+      <w:lvlText w:val="o"/>
+      <w:lvlJc w:val="left"/>
+      <w:pPr>
+        <w:ind w:left="5760" w:hanging="360"/>
+      </w:pPr>
+      <w:rPr>
+        <w:rFonts w:ascii="Courier New" w:hAnsi="Courier New" w:cs="Courier New" w:hint="default"/>
+      </w:rPr>
+    </w:lvl>
+    <w:lvl w:ilvl="8" w:tplc="18090005" w:tentative="1">
+      <w:start w:val="1"/>
+      <w:numFmt w:val="bullet"/>
+      <w:lvlText w:val=""/>
+      <w:lvlJc w:val="left"/>
+      <w:pPr>
+        <w:ind w:left="6480" w:hanging="360"/>
+      </w:pPr>
+      <w:rPr>
+        <w:rFonts w:ascii="Wingdings" w:hAnsi="Wingdings" w:hint="default"/>
+      </w:rPr>
+    </w:lvl>
+  </w:abstractNum>
+  <w:abstractNum w:abstractNumId="23" w15:restartNumberingAfterBreak="0">
     <w:nsid w:val="69941245"/>
     <w:multiLevelType w:val="multilevel"/>
     <w:tmpl w:val="0CE615E8"/>
@@ -2206,7 +4851,7 @@
       </w:rPr>
     </w:lvl>
   </w:abstractNum>
-  <w:abstractNum w:abstractNumId="14" w15:restartNumberingAfterBreak="0">
+  <w:abstractNum w:abstractNumId="24" w15:restartNumberingAfterBreak="0">
     <w:nsid w:val="7ADE56F6"/>
     <w:multiLevelType w:val="hybridMultilevel"/>
     <w:tmpl w:val="DD7EC880"/>
@@ -2319,7 +4964,7 @@
       </w:rPr>
     </w:lvl>
   </w:abstractNum>
-  <w:abstractNum w:abstractNumId="15" w15:restartNumberingAfterBreak="0">
+  <w:abstractNum w:abstractNumId="25" w15:restartNumberingAfterBreak="0">
     <w:nsid w:val="7F5413EB"/>
     <w:multiLevelType w:val="hybridMultilevel"/>
     <w:tmpl w:val="9562381E"/>
@@ -2433,52 +5078,82 @@
     </w:lvl>
   </w:abstractNum>
   <w:num w:numId="1" w16cid:durableId="1696805773">
+    <w:abstractNumId w:val="14"/>
+  </w:num>
+  <w:num w:numId="2" w16cid:durableId="1643848138">
+    <w:abstractNumId w:val="17"/>
+  </w:num>
+  <w:num w:numId="3" w16cid:durableId="305475852">
+    <w:abstractNumId w:val="12"/>
+  </w:num>
+  <w:num w:numId="4" w16cid:durableId="1567566509">
+    <w:abstractNumId w:val="19"/>
+  </w:num>
+  <w:num w:numId="5" w16cid:durableId="1756828685">
+    <w:abstractNumId w:val="23"/>
+  </w:num>
+  <w:num w:numId="6" w16cid:durableId="1728723885">
     <w:abstractNumId w:val="8"/>
   </w:num>
-  <w:num w:numId="2" w16cid:durableId="1643848138">
+  <w:num w:numId="7" w16cid:durableId="1610626072">
+    <w:abstractNumId w:val="11"/>
+  </w:num>
+  <w:num w:numId="8" w16cid:durableId="418598507">
+    <w:abstractNumId w:val="9"/>
+  </w:num>
+  <w:num w:numId="9" w16cid:durableId="77868334">
+    <w:abstractNumId w:val="2"/>
+  </w:num>
+  <w:num w:numId="10" w16cid:durableId="1819226177">
+    <w:abstractNumId w:val="24"/>
+  </w:num>
+  <w:num w:numId="11" w16cid:durableId="313873546">
+    <w:abstractNumId w:val="1"/>
+  </w:num>
+  <w:num w:numId="12" w16cid:durableId="480738171">
+    <w:abstractNumId w:val="25"/>
+  </w:num>
+  <w:num w:numId="13" w16cid:durableId="837891054">
+    <w:abstractNumId w:val="18"/>
+  </w:num>
+  <w:num w:numId="14" w16cid:durableId="1841771239">
+    <w:abstractNumId w:val="4"/>
+  </w:num>
+  <w:num w:numId="15" w16cid:durableId="1559589220">
+    <w:abstractNumId w:val="15"/>
+  </w:num>
+  <w:num w:numId="16" w16cid:durableId="2033870245">
+    <w:abstractNumId w:val="7"/>
+  </w:num>
+  <w:num w:numId="17" w16cid:durableId="435639846">
+    <w:abstractNumId w:val="20"/>
+  </w:num>
+  <w:num w:numId="18" w16cid:durableId="738214008">
+    <w:abstractNumId w:val="5"/>
+  </w:num>
+  <w:num w:numId="19" w16cid:durableId="92212218">
+    <w:abstractNumId w:val="0"/>
+  </w:num>
+  <w:num w:numId="20" w16cid:durableId="836120080">
+    <w:abstractNumId w:val="16"/>
+  </w:num>
+  <w:num w:numId="21" w16cid:durableId="1791779942">
+    <w:abstractNumId w:val="22"/>
+  </w:num>
+  <w:num w:numId="22" w16cid:durableId="777023780">
+    <w:abstractNumId w:val="3"/>
+  </w:num>
+  <w:num w:numId="23" w16cid:durableId="1801998175">
+    <w:abstractNumId w:val="13"/>
+  </w:num>
+  <w:num w:numId="24" w16cid:durableId="1844346781">
     <w:abstractNumId w:val="10"/>
   </w:num>
-  <w:num w:numId="3" w16cid:durableId="305475852">
-    <w:abstractNumId w:val="7"/>
-  </w:num>
-  <w:num w:numId="4" w16cid:durableId="1567566509">
-    <w:abstractNumId w:val="12"/>
-  </w:num>
-  <w:num w:numId="5" w16cid:durableId="1756828685">
-    <w:abstractNumId w:val="13"/>
-  </w:num>
-  <w:num w:numId="6" w16cid:durableId="1728723885">
-    <w:abstractNumId w:val="4"/>
-  </w:num>
-  <w:num w:numId="7" w16cid:durableId="1610626072">
+  <w:num w:numId="25" w16cid:durableId="1758667910">
     <w:abstractNumId w:val="6"/>
   </w:num>
-  <w:num w:numId="8" w16cid:durableId="418598507">
-    <w:abstractNumId w:val="5"/>
-  </w:num>
-  <w:num w:numId="9" w16cid:durableId="77868334">
-    <w:abstractNumId w:val="1"/>
-  </w:num>
-  <w:num w:numId="10" w16cid:durableId="1819226177">
-    <w:abstractNumId w:val="14"/>
-  </w:num>
-  <w:num w:numId="11" w16cid:durableId="313873546">
-    <w:abstractNumId w:val="0"/>
-  </w:num>
-  <w:num w:numId="12" w16cid:durableId="480738171">
-    <w:abstractNumId w:val="15"/>
-  </w:num>
-  <w:num w:numId="13" w16cid:durableId="837891054">
-    <w:abstractNumId w:val="11"/>
-  </w:num>
-  <w:num w:numId="14" w16cid:durableId="1841771239">
-    <w:abstractNumId w:val="2"/>
-  </w:num>
-  <w:num w:numId="15" w16cid:durableId="1559589220">
-    <w:abstractNumId w:val="9"/>
-  </w:num>
-  <w:num w:numId="16" w16cid:durableId="2033870245">
-    <w:abstractNumId w:val="3"/>
+  <w:num w:numId="26" w16cid:durableId="678040578">
+    <w:abstractNumId w:val="21"/>
   </w:num>
 </w:numbering>
 </file>

</xml_diff>